<commit_message>
Commit de pequenas ediciones
</commit_message>
<xml_diff>
--- a/Memoria de prácticas externas - David Valcárcel Herrera.docx
+++ b/Memoria de prácticas externas - David Valcárcel Herrera.docx
@@ -389,27 +389,7 @@
                                           <w:szCs w:val="18"/>
                                           <w:lang w:val="es-ES"/>
                                         </w:rPr>
-                                        <w:t xml:space="preserve">Edificio 22 - Facultad de </w:t>
-                                      </w:r>
-                                      <w:proofErr w:type="spellStart"/>
-                                      <w:r>
-                                        <w:rPr>
-                                          <w:color w:val="FFFFFF" w:themeColor="background1"/>
-                                          <w:sz w:val="18"/>
-                                          <w:szCs w:val="18"/>
-                                          <w:lang w:val="es-ES"/>
-                                        </w:rPr>
-                                        <w:t>Educacion</w:t>
-                                      </w:r>
-                                      <w:proofErr w:type="spellEnd"/>
-                                      <w:r>
-                                        <w:rPr>
-                                          <w:color w:val="FFFFFF" w:themeColor="background1"/>
-                                          <w:sz w:val="18"/>
-                                          <w:szCs w:val="18"/>
-                                          <w:lang w:val="es-ES"/>
-                                        </w:rPr>
-                                        <w:t xml:space="preserve"> 2</w:t>
+                                        <w:t>Edificio 22 - Facultad de Educacion 2</w:t>
                                       </w:r>
                                     </w:sdtContent>
                                   </w:sdt>
@@ -656,27 +636,7 @@
                                     <w:szCs w:val="18"/>
                                     <w:lang w:val="es-ES"/>
                                   </w:rPr>
-                                  <w:t xml:space="preserve">Edificio 22 - Facultad de </w:t>
-                                </w:r>
-                                <w:proofErr w:type="spellStart"/>
-                                <w:r>
-                                  <w:rPr>
-                                    <w:color w:val="FFFFFF" w:themeColor="background1"/>
-                                    <w:sz w:val="18"/>
-                                    <w:szCs w:val="18"/>
-                                    <w:lang w:val="es-ES"/>
-                                  </w:rPr>
-                                  <w:t>Educacion</w:t>
-                                </w:r>
-                                <w:proofErr w:type="spellEnd"/>
-                                <w:r>
-                                  <w:rPr>
-                                    <w:color w:val="FFFFFF" w:themeColor="background1"/>
-                                    <w:sz w:val="18"/>
-                                    <w:szCs w:val="18"/>
-                                    <w:lang w:val="es-ES"/>
-                                  </w:rPr>
-                                  <w:t xml:space="preserve"> 2</w:t>
+                                  <w:t>Edificio 22 - Facultad de Educacion 2</w:t>
                                 </w:r>
                               </w:sdtContent>
                             </w:sdt>
@@ -2562,21 +2522,7 @@
         <w:rPr>
           <w:lang w:val="es-ES"/>
         </w:rPr>
-        <w:t xml:space="preserve">, que es con quien más </w:t>
-      </w:r>
-      <w:proofErr w:type="gramStart"/>
-      <w:r>
-        <w:rPr>
-          <w:lang w:val="es-ES"/>
-        </w:rPr>
-        <w:t>trabaje</w:t>
-      </w:r>
-      <w:proofErr w:type="gramEnd"/>
-      <w:r>
-        <w:rPr>
-          <w:lang w:val="es-ES"/>
-        </w:rPr>
-        <w:t xml:space="preserve"> al final y me ayudaba con las prácticas.</w:t>
+        <w:t>, que es con quien más trabaje al final y me ayudaba con las prácticas.</w:t>
       </w:r>
     </w:p>
     <w:p>
@@ -2611,6 +2557,7 @@
       </w:pPr>
       <w:r>
         <w:rPr>
+          <w:noProof/>
           <w:lang w:val="es-ES"/>
         </w:rPr>
         <w:drawing>
@@ -2906,35 +2853,7 @@
         <w:rPr>
           <w:lang w:val="es-ES"/>
         </w:rPr>
-        <w:t xml:space="preserve">) y el propio laboratorio constaba de múltiples aparatos de medida e incluso </w:t>
-      </w:r>
-      <w:proofErr w:type="spellStart"/>
-      <w:r>
-        <w:rPr>
-          <w:lang w:val="es-ES"/>
-        </w:rPr>
-        <w:t>criogenizadores</w:t>
-      </w:r>
-      <w:proofErr w:type="spellEnd"/>
-      <w:r>
-        <w:rPr>
-          <w:lang w:val="es-ES"/>
-        </w:rPr>
-        <w:t xml:space="preserve"> para realizar estudios de botánica. La sala donde hacía los trabajos era el propio laboratorio, que también contaba con aire acondicionado para refrigerar la sala. También durante el período de prácticas (mes de julio fundamentalmente), ambos profesores y otros también estuvieron coordinando </w:t>
-      </w:r>
-      <w:proofErr w:type="spellStart"/>
-      <w:r>
-        <w:rPr>
-          <w:lang w:val="es-ES"/>
-        </w:rPr>
-        <w:t>TFGs</w:t>
-      </w:r>
-      <w:proofErr w:type="spellEnd"/>
-      <w:r>
-        <w:rPr>
-          <w:lang w:val="es-ES"/>
-        </w:rPr>
-        <w:t xml:space="preserve"> para el grado de Ciencias del Mar. </w:t>
+        <w:t xml:space="preserve">) y el propio laboratorio constaba de múltiples aparatos de medida e incluso criogenizadores para realizar estudios de botánica. La sala donde hacía los trabajos era el propio laboratorio, que también contaba con aire acondicionado para refrigerar la sala. También durante el período de prácticas (mes de julio fundamentalmente), ambos profesores y otros también estuvieron coordinando TFGs para el grado de Ciencias del Mar. </w:t>
       </w:r>
     </w:p>
     <w:p>
@@ -3037,78 +2956,14 @@
         <w:rPr>
           <w:lang w:val="es-ES"/>
         </w:rPr>
-        <w:t xml:space="preserve">(en particular, enfocándonos en </w:t>
-      </w:r>
-      <w:proofErr w:type="spellStart"/>
-      <w:r>
-        <w:rPr>
-          <w:lang w:val="es-ES"/>
-        </w:rPr>
-        <w:t>AN</w:t>
-      </w:r>
-      <w:r>
-        <w:rPr>
-          <w:lang w:val="es-ES"/>
-        </w:rPr>
-        <w:t>OVAs</w:t>
-      </w:r>
-      <w:proofErr w:type="spellEnd"/>
-      <w:r>
-        <w:rPr>
-          <w:lang w:val="es-ES"/>
-        </w:rPr>
-        <w:t xml:space="preserve">, </w:t>
-      </w:r>
-      <w:proofErr w:type="spellStart"/>
-      <w:r>
-        <w:rPr>
-          <w:lang w:val="es-ES"/>
-        </w:rPr>
-        <w:t>LMs</w:t>
-      </w:r>
-      <w:proofErr w:type="spellEnd"/>
-      <w:r>
-        <w:rPr>
-          <w:lang w:val="es-ES"/>
-        </w:rPr>
-        <w:t xml:space="preserve">, </w:t>
-      </w:r>
-      <w:proofErr w:type="spellStart"/>
-      <w:r>
-        <w:rPr>
-          <w:lang w:val="es-ES"/>
-        </w:rPr>
-        <w:t>GLMs</w:t>
-      </w:r>
-      <w:proofErr w:type="spellEnd"/>
-      <w:r>
-        <w:rPr>
-          <w:lang w:val="es-ES"/>
-        </w:rPr>
-        <w:t xml:space="preserve"> y </w:t>
-      </w:r>
-      <w:proofErr w:type="spellStart"/>
-      <w:r>
-        <w:rPr>
-          <w:lang w:val="es-ES"/>
-        </w:rPr>
-        <w:t>GLMMs</w:t>
-      </w:r>
-      <w:proofErr w:type="spellEnd"/>
-      <w:r>
-        <w:rPr>
-          <w:lang w:val="es-ES"/>
-        </w:rPr>
-        <w:t xml:space="preserve"> y técnicas de ML no supervisado como ACP o análisis de </w:t>
-      </w:r>
-      <w:proofErr w:type="spellStart"/>
-      <w:r>
-        <w:rPr>
-          <w:lang w:val="es-ES"/>
-        </w:rPr>
-        <w:t>clusters</w:t>
-      </w:r>
-      <w:proofErr w:type="spellEnd"/>
+        <w:t>(en particular, enfocándonos en AN</w:t>
+      </w:r>
+      <w:r>
+        <w:rPr>
+          <w:lang w:val="es-ES"/>
+        </w:rPr>
+        <w:t>OVAs, LMs, GLMs y GLMMs y técnicas de ML no supervisado como ACP o análisis de clusters</w:t>
+      </w:r>
       <w:r>
         <w:rPr>
           <w:lang w:val="es-ES"/>
@@ -3145,21 +3000,7 @@
         <w:rPr>
           <w:lang w:val="es-ES"/>
         </w:rPr>
-        <w:t xml:space="preserve">Las prácticas en empresa consistieron en 3 actividades propuestas por Miguel Rodrigo Valverde Urrea, que también es profesor de la universidad y trabaja con mi tutor de empresa Federico López Moya. En primer lugar, éste me explicaba en qué consistiría la actividad para después y una idea/esquema de cómo realizarla y empezar a hacer los ejercicios. He utilizado el lenguaje de programación estadística conocido como R para los 3 proyectos, mediante el sistema de publicación y creación de documentos científicos de código abierto que genera informes conocido como </w:t>
-      </w:r>
-      <w:proofErr w:type="spellStart"/>
-      <w:r>
-        <w:rPr>
-          <w:lang w:val="es-ES"/>
-        </w:rPr>
-        <w:t>Quarto</w:t>
-      </w:r>
-      <w:proofErr w:type="spellEnd"/>
-      <w:r>
-        <w:rPr>
-          <w:lang w:val="es-ES"/>
-        </w:rPr>
-        <w:t xml:space="preserve">, para mayor legibilidad. Las tres tareas </w:t>
+        <w:t xml:space="preserve">Las prácticas en empresa consistieron en 3 actividades propuestas por Miguel Rodrigo Valverde Urrea, que también es profesor de la universidad y trabaja con mi tutor de empresa Federico López Moya. En primer lugar, éste me explicaba en qué consistiría la actividad para después y una idea/esquema de cómo realizarla y empezar a hacer los ejercicios. He utilizado el lenguaje de programación estadística conocido como R para los 3 proyectos, mediante el sistema de publicación y creación de documentos científicos de código abierto que genera informes conocido como Quarto, para mayor legibilidad. Las tres tareas </w:t>
       </w:r>
       <w:r>
         <w:rPr>
@@ -3204,35 +3045,7 @@
         <w:rPr>
           <w:lang w:val="es-ES"/>
         </w:rPr>
-        <w:t xml:space="preserve"> Explicación de diferencias entre data </w:t>
-      </w:r>
-      <w:proofErr w:type="spellStart"/>
-      <w:r>
-        <w:rPr>
-          <w:lang w:val="es-ES"/>
-        </w:rPr>
-        <w:t>science</w:t>
-      </w:r>
-      <w:proofErr w:type="spellEnd"/>
-      <w:r>
-        <w:rPr>
-          <w:lang w:val="es-ES"/>
-        </w:rPr>
-        <w:t xml:space="preserve"> y data </w:t>
-      </w:r>
-      <w:proofErr w:type="spellStart"/>
-      <w:r>
-        <w:rPr>
-          <w:lang w:val="es-ES"/>
-        </w:rPr>
-        <w:t>analysis</w:t>
-      </w:r>
-      <w:proofErr w:type="spellEnd"/>
-      <w:r>
-        <w:rPr>
-          <w:lang w:val="es-ES"/>
-        </w:rPr>
-        <w:t xml:space="preserve">. Concepto de poder estadístico → probabilidad de detectar efecto real; depende de tamaño de muestra y tamaño del efecto. Repaso y aplicación de conceptos de ANOVA de uno y </w:t>
+        <w:t xml:space="preserve"> Explicación de diferencias entre data science y data analysis. Concepto de poder estadístico → probabilidad de detectar efecto real; depende de tamaño de muestra y tamaño del efecto. Repaso y aplicación de conceptos de ANOVA de uno y </w:t>
       </w:r>
       <w:r>
         <w:rPr>
@@ -3245,21 +3058,7 @@
         <w:rPr>
           <w:lang w:val="es-ES"/>
         </w:rPr>
-        <w:t xml:space="preserve"> factor </w:t>
-      </w:r>
-      <w:proofErr w:type="spellStart"/>
-      <w:r>
-        <w:rPr>
-          <w:lang w:val="es-ES"/>
-        </w:rPr>
-        <w:t>trtf</w:t>
-      </w:r>
-      <w:proofErr w:type="spellEnd"/>
-      <w:r>
-        <w:rPr>
-          <w:lang w:val="es-ES"/>
-        </w:rPr>
-        <w:t xml:space="preserve"> </w:t>
+        <w:t xml:space="preserve"> factor trtf </w:t>
       </w:r>
       <w:r>
         <w:rPr>
@@ -3345,21 +3144,7 @@
         <w:rPr>
           <w:lang w:val="es-ES"/>
         </w:rPr>
-        <w:t xml:space="preserve"> </w:t>
-      </w:r>
-      <w:proofErr w:type="spellStart"/>
-      <w:r>
-        <w:rPr>
-          <w:lang w:val="es-ES"/>
-        </w:rPr>
-        <w:t>GLMs</w:t>
-      </w:r>
-      <w:proofErr w:type="spellEnd"/>
-      <w:r>
-        <w:rPr>
-          <w:lang w:val="es-ES"/>
-        </w:rPr>
-        <w:t xml:space="preserve"> para evaluar diferencia</w:t>
+        <w:t xml:space="preserve"> GLMs para evaluar diferencia</w:t>
       </w:r>
       <w:r>
         <w:rPr>
@@ -3427,21 +3212,7 @@
         <w:rPr>
           <w:lang w:val="es-ES"/>
         </w:rPr>
-        <w:t xml:space="preserve"> de eficacia (</w:t>
-      </w:r>
-      <w:proofErr w:type="spellStart"/>
-      <w:r>
-        <w:rPr>
-          <w:lang w:val="es-ES"/>
-        </w:rPr>
-        <w:t>semi-campo</w:t>
-      </w:r>
-      <w:proofErr w:type="spellEnd"/>
-      <w:r>
-        <w:rPr>
-          <w:lang w:val="es-ES"/>
-        </w:rPr>
-        <w:t>, Italia) sobre insecticidas</w:t>
+        <w:t xml:space="preserve"> de eficacia (semi-campo, Italia) sobre insecticidas</w:t>
       </w:r>
       <w:r>
         <w:rPr>
@@ -3465,79 +3236,27 @@
         <w:rPr>
           <w:lang w:val="es-ES"/>
         </w:rPr>
-        <w:t xml:space="preserve"> ISOCLAST®/</w:t>
-      </w:r>
-      <w:proofErr w:type="spellStart"/>
-      <w:r>
-        <w:rPr>
-          <w:lang w:val="es-ES"/>
-        </w:rPr>
-        <w:t>sulfoxaflor</w:t>
-      </w:r>
-      <w:proofErr w:type="spellEnd"/>
-      <w:r>
-        <w:rPr>
-          <w:lang w:val="es-ES"/>
-        </w:rPr>
-        <w:t xml:space="preserve">— contra </w:t>
-      </w:r>
-      <w:proofErr w:type="spellStart"/>
-      <w:r>
-        <w:rPr>
-          <w:lang w:val="es-ES"/>
-        </w:rPr>
-        <w:t>Philaenus</w:t>
-      </w:r>
-      <w:proofErr w:type="spellEnd"/>
+        <w:t xml:space="preserve"> ISOCLAST®/sulfoxaflor— contra Philaenus spumarius, vector de</w:t>
+      </w:r>
+      <w:r>
+        <w:rPr>
+          <w:lang w:val="es-ES"/>
+        </w:rPr>
+        <w:t>l insecto</w:t>
+      </w:r>
       <w:r>
         <w:rPr>
           <w:lang w:val="es-ES"/>
         </w:rPr>
         <w:t xml:space="preserve"> </w:t>
       </w:r>
-      <w:proofErr w:type="spellStart"/>
-      <w:r>
-        <w:rPr>
-          <w:lang w:val="es-ES"/>
-        </w:rPr>
-        <w:t>spumarius</w:t>
-      </w:r>
-      <w:proofErr w:type="spellEnd"/>
-      <w:r>
-        <w:rPr>
-          <w:lang w:val="es-ES"/>
-        </w:rPr>
-        <w:t>, vector de</w:t>
-      </w:r>
-      <w:r>
-        <w:rPr>
-          <w:lang w:val="es-ES"/>
-        </w:rPr>
-        <w:t>l insecto</w:t>
-      </w:r>
-      <w:r>
-        <w:rPr>
-          <w:lang w:val="es-ES"/>
-        </w:rPr>
-        <w:t xml:space="preserve"> </w:t>
-      </w:r>
-      <w:proofErr w:type="spellStart"/>
       <w:r>
         <w:rPr>
           <w:i/>
           <w:iCs/>
           <w:lang w:val="es-ES"/>
         </w:rPr>
-        <w:t>Xylella</w:t>
-      </w:r>
-      <w:proofErr w:type="spellEnd"/>
-      <w:r>
-        <w:rPr>
-          <w:i/>
-          <w:iCs/>
-          <w:lang w:val="es-ES"/>
-        </w:rPr>
-        <w:t xml:space="preserve"> fastidiosa</w:t>
+        <w:t>Xylella fastidiosa</w:t>
       </w:r>
       <w:r>
         <w:rPr>
@@ -3679,16 +3398,8 @@
         <w:rPr>
           <w:lang w:val="es-ES"/>
         </w:rPr>
-        <w:t xml:space="preserve"> este proyecto se han hecho análisis de varios tipos y aprendí a manejar de manera práctica en R los </w:t>
-      </w:r>
-      <w:proofErr w:type="spellStart"/>
-      <w:r>
-        <w:rPr>
-          <w:lang w:val="es-ES"/>
-        </w:rPr>
-        <w:t>LMMs</w:t>
-      </w:r>
-      <w:proofErr w:type="spellEnd"/>
+        <w:t xml:space="preserve"> este proyecto se han hecho análisis de varios tipos y aprendí a manejar de manera práctica en R los LMMs</w:t>
+      </w:r>
       <w:r>
         <w:rPr>
           <w:lang w:val="es-ES"/>
@@ -3699,21 +3410,7 @@
         <w:rPr>
           <w:lang w:val="es-ES"/>
         </w:rPr>
-        <w:t xml:space="preserve">y </w:t>
-      </w:r>
-      <w:proofErr w:type="spellStart"/>
-      <w:r>
-        <w:rPr>
-          <w:lang w:val="es-ES"/>
-        </w:rPr>
-        <w:t>GLMMs</w:t>
-      </w:r>
-      <w:proofErr w:type="spellEnd"/>
-      <w:r>
-        <w:rPr>
-          <w:lang w:val="es-ES"/>
-        </w:rPr>
-        <w:t xml:space="preserve"> (</w:t>
+        <w:t>y GLMMs (</w:t>
       </w:r>
       <w:r>
         <w:rPr>
@@ -3785,35 +3482,7 @@
         <w:rPr>
           <w:lang w:val="es-ES"/>
         </w:rPr>
-        <w:t xml:space="preserve">), así como a familiarizarme más con las técnicas de machine </w:t>
-      </w:r>
-      <w:proofErr w:type="spellStart"/>
-      <w:r>
-        <w:rPr>
-          <w:lang w:val="es-ES"/>
-        </w:rPr>
-        <w:t>learning</w:t>
-      </w:r>
-      <w:proofErr w:type="spellEnd"/>
-      <w:r>
-        <w:rPr>
-          <w:lang w:val="es-ES"/>
-        </w:rPr>
-        <w:t xml:space="preserve"> de análisis no supervisado, en particular con la clasificación de datos en </w:t>
-      </w:r>
-      <w:proofErr w:type="spellStart"/>
-      <w:r>
-        <w:rPr>
-          <w:lang w:val="es-ES"/>
-        </w:rPr>
-        <w:t>clusters</w:t>
-      </w:r>
-      <w:proofErr w:type="spellEnd"/>
-      <w:r>
-        <w:rPr>
-          <w:lang w:val="es-ES"/>
-        </w:rPr>
-        <w:t xml:space="preserve"> (análisis </w:t>
+        <w:t xml:space="preserve">), así como a familiarizarme más con las técnicas de machine learning de análisis no supervisado, en particular con la clasificación de datos en clusters (análisis </w:t>
       </w:r>
       <w:r>
         <w:rPr>
@@ -3821,7 +3490,6 @@
         </w:rPr>
         <w:t xml:space="preserve">de </w:t>
       </w:r>
-      <w:proofErr w:type="spellStart"/>
       <w:r>
         <w:rPr>
           <w:lang w:val="es-ES"/>
@@ -3834,7 +3502,6 @@
         </w:rPr>
         <w:t>s</w:t>
       </w:r>
-      <w:proofErr w:type="spellEnd"/>
       <w:r>
         <w:rPr>
           <w:lang w:val="es-ES"/>
@@ -3857,35 +3524,13 @@
         <w:rPr>
           <w:lang w:val="es-ES"/>
         </w:rPr>
-        <w:t xml:space="preserve"> para elegir por ejemplo el número de </w:t>
-      </w:r>
-      <w:proofErr w:type="spellStart"/>
-      <w:r>
-        <w:rPr>
-          <w:lang w:val="es-ES"/>
-        </w:rPr>
-        <w:t>clusters</w:t>
-      </w:r>
-      <w:proofErr w:type="spellEnd"/>
-      <w:r>
-        <w:rPr>
-          <w:lang w:val="es-ES"/>
-        </w:rPr>
-        <w:t xml:space="preserve">) e incluso mostrando gráficamente los </w:t>
-      </w:r>
-      <w:proofErr w:type="spellStart"/>
-      <w:r>
-        <w:rPr>
-          <w:lang w:val="es-ES"/>
-        </w:rPr>
-        <w:t>clusters</w:t>
-      </w:r>
-      <w:proofErr w:type="spellEnd"/>
-      <w:r>
-        <w:rPr>
-          <w:lang w:val="es-ES"/>
-        </w:rPr>
-        <w:t xml:space="preserve"> reduciendo las componentes a 2 usando ACP (análisis de componentes principales).</w:t>
+        <w:t xml:space="preserve"> para elegir por ejemplo el número de clusters</w:t>
+      </w:r>
+      <w:r>
+        <w:rPr>
+          <w:lang w:val="es-ES"/>
+        </w:rPr>
+        <w:t>) e incluso mostrando gráficamente los clusters reduciendo las componentes a 2 usando ACP (análisis de componentes principales).</w:t>
       </w:r>
       <w:r>
         <w:rPr>
@@ -4150,35 +3795,7 @@
           <w:lang w:val="es-ES"/>
         </w:rPr>
         <w:lastRenderedPageBreak/>
-        <w:t xml:space="preserve">Por último, decir que, algunos modelos que acabamos tomando para mayor robustez de los mismos y asegurar mejor que el diagnóstico de los residuos valide el modelo (tampoco había gran diferencia a nivel del modelo per se) fueron </w:t>
-      </w:r>
-      <w:proofErr w:type="spellStart"/>
-      <w:r>
-        <w:rPr>
-          <w:lang w:val="es-ES"/>
-        </w:rPr>
-        <w:t>weighted</w:t>
-      </w:r>
-      <w:proofErr w:type="spellEnd"/>
-      <w:r>
-        <w:rPr>
-          <w:lang w:val="es-ES"/>
-        </w:rPr>
-        <w:t xml:space="preserve"> </w:t>
-      </w:r>
-      <w:proofErr w:type="spellStart"/>
-      <w:r>
-        <w:rPr>
-          <w:lang w:val="es-ES"/>
-        </w:rPr>
-        <w:t>LMMs</w:t>
-      </w:r>
-      <w:proofErr w:type="spellEnd"/>
-      <w:r>
-        <w:rPr>
-          <w:lang w:val="es-ES"/>
-        </w:rPr>
-        <w:t>, que son modelos lineales mixtos en los que hay heterocedasticidad entre grupos, estimando unos pesos asignados a las observaciones.</w:t>
+        <w:t>Por último, decir que, algunos modelos que acabamos tomando para mayor robustez de los mismos y asegurar mejor que el diagnóstico de los residuos valide el modelo (tampoco había gran diferencia a nivel del modelo per se) fueron weighted LMMs, que son modelos lineales mixtos en los que hay heterocedasticidad entre grupos, estimando unos pesos asignados a las observaciones.</w:t>
       </w:r>
     </w:p>
     <w:p>
@@ -4210,21 +3827,7 @@
         <w:rPr>
           <w:lang w:val="es-ES"/>
         </w:rPr>
-        <w:t xml:space="preserve"> (o aprendí a manejarme algo más, si bien con bastante ayuda) con múltiples paquetes de R, sobre todo </w:t>
-      </w:r>
-      <w:proofErr w:type="spellStart"/>
-      <w:r>
-        <w:rPr>
-          <w:lang w:val="es-ES"/>
-        </w:rPr>
-        <w:t>dplyr</w:t>
-      </w:r>
-      <w:proofErr w:type="spellEnd"/>
-      <w:r>
-        <w:rPr>
-          <w:lang w:val="es-ES"/>
-        </w:rPr>
-        <w:t xml:space="preserve"> y ggplot2.</w:t>
+        <w:t xml:space="preserve"> (o aprendí a manejarme algo más, si bien con bastante ayuda) con múltiples paquetes de R, sobre todo dplyr y ggplot2.</w:t>
       </w:r>
     </w:p>
     <w:p>
@@ -4294,32 +3897,11 @@
           <w:lang w:val="es-ES"/>
         </w:rPr>
       </w:pPr>
-    </w:p>
-    <w:p>
-      <w:pPr>
-        <w:rPr>
-          <w:lang w:val="es-ES"/>
-        </w:rPr>
-      </w:pPr>
-      <w:r>
-        <w:rPr>
-          <w:lang w:val="es-ES"/>
-        </w:rPr>
-        <w:t xml:space="preserve">El primer día consistió en una reunión que tuve en el despacho de Federico junto a Miguel en el que Federico me explicó que iba a estar con él y lo que tenía pensado que hiciera. Por motivos de trabajo, más adelante me dijeron de cambiar el proyecto de análisis de </w:t>
-      </w:r>
-      <w:proofErr w:type="spellStart"/>
-      <w:r>
-        <w:rPr>
-          <w:lang w:val="es-ES"/>
-        </w:rPr>
-        <w:t>RNAseq</w:t>
-      </w:r>
-      <w:proofErr w:type="spellEnd"/>
-      <w:r>
-        <w:rPr>
-          <w:lang w:val="es-ES"/>
-        </w:rPr>
-        <w:t xml:space="preserve"> por el proyecto </w:t>
+      <w:r>
+        <w:rPr>
+          <w:lang w:val="es-ES"/>
+        </w:rPr>
+        <w:t xml:space="preserve">El primer día consistió en una reunión que tuve en el despacho de Federico junto a Miguel en el que Federico me explicó que iba a estar con él y lo que tenía pensado que hiciera. Por motivos de trabajo, más adelante me dijeron de cambiar el proyecto de análisis de RNAseq por el proyecto </w:t>
       </w:r>
       <w:r>
         <w:rPr>
@@ -4337,16 +3919,8 @@
         <w:rPr>
           <w:lang w:val="es-ES"/>
         </w:rPr>
-        <w:t xml:space="preserve"> hacer lo del </w:t>
-      </w:r>
-      <w:proofErr w:type="spellStart"/>
-      <w:r>
-        <w:rPr>
-          <w:lang w:val="es-ES"/>
-        </w:rPr>
-        <w:t>RNAseq</w:t>
-      </w:r>
-      <w:proofErr w:type="spellEnd"/>
+        <w:t xml:space="preserve"> hacer lo del RNAseq</w:t>
+      </w:r>
       <w:r>
         <w:rPr>
           <w:lang w:val="es-ES"/>
@@ -4496,41 +4070,13 @@
         <w:rPr>
           <w:lang w:val="es-ES"/>
         </w:rPr>
-        <w:t xml:space="preserve">También le fui mandando cada cierto tiempo (unos 5-7 días) lo que tenía de la actividad 3, junto al PowerPoint que fui haciendo ya de cara al final. La actividad 1 y 2 las pude hacer prácticamente en 8 o 9 días, contando trabajo en casa los fines de semana (eran actividades para familiarizarme, aunque también con </w:t>
-      </w:r>
-      <w:proofErr w:type="spellStart"/>
-      <w:r>
-        <w:rPr>
-          <w:lang w:val="es-ES"/>
-        </w:rPr>
-        <w:t>datasets</w:t>
-      </w:r>
-      <w:proofErr w:type="spellEnd"/>
-      <w:r>
-        <w:rPr>
-          <w:lang w:val="es-ES"/>
-        </w:rPr>
-        <w:t xml:space="preserve"> reales). La actividad 3 fue la </w:t>
-      </w:r>
-      <w:r>
-        <w:rPr>
-          <w:lang w:val="es-ES"/>
-        </w:rPr>
-        <w:t xml:space="preserve">extensa, debido a que se trataba de un </w:t>
-      </w:r>
-      <w:proofErr w:type="spellStart"/>
-      <w:r>
-        <w:rPr>
-          <w:lang w:val="es-ES"/>
-        </w:rPr>
-        <w:t>dataset</w:t>
-      </w:r>
-      <w:proofErr w:type="spellEnd"/>
-      <w:r>
-        <w:rPr>
-          <w:lang w:val="es-ES"/>
-        </w:rPr>
-        <w:t xml:space="preserve"> más complicado en el que </w:t>
+        <w:t xml:space="preserve">También le fui mandando cada cierto tiempo (unos 5-7 días) lo que tenía de la actividad 3, junto al PowerPoint que fui haciendo ya de cara al final. La actividad 1 y 2 las pude hacer prácticamente en 8 o 9 días, contando trabajo en casa los fines de semana (eran actividades para familiarizarme, aunque también con datasets reales). La actividad 3 fue la </w:t>
+      </w:r>
+      <w:r>
+        <w:rPr>
+          <w:lang w:val="es-ES"/>
+        </w:rPr>
+        <w:t xml:space="preserve">extensa, debido a que se trataba de un dataset más complicado en el que </w:t>
       </w:r>
       <w:r>
         <w:rPr>
@@ -4619,21 +4165,7 @@
         <w:rPr>
           <w:lang w:val="es-ES"/>
         </w:rPr>
-        <w:t xml:space="preserve">Para el desarrollo de las prácticas, utilicé principalmente mi ordenador para el desarrollo del código, del PowerPoint y de la memoria. El código está escrito en una libreta de </w:t>
-      </w:r>
-      <w:proofErr w:type="spellStart"/>
-      <w:r>
-        <w:rPr>
-          <w:lang w:val="es-ES"/>
-        </w:rPr>
-        <w:t>Quarto</w:t>
-      </w:r>
-      <w:proofErr w:type="spellEnd"/>
-      <w:r>
-        <w:rPr>
-          <w:lang w:val="es-ES"/>
-        </w:rPr>
-        <w:t xml:space="preserve"> (</w:t>
+        <w:t>Para el desarrollo de las prácticas, utilicé principalmente mi ordenador para el desarrollo del código, del PowerPoint y de la memoria. El código está escrito en una libreta de Quarto (</w:t>
       </w:r>
       <w:r>
         <w:rPr>
@@ -4657,39 +4189,13 @@
         <w:rPr>
           <w:lang w:val="es-ES"/>
         </w:rPr>
-        <w:t xml:space="preserve"> También me apoyé alguna que otra vez en IA para consultas (me dijo él que la usara, ya que le interesaba mi análisis más que </w:t>
-      </w:r>
-      <w:proofErr w:type="spellStart"/>
-      <w:r>
-        <w:rPr>
-          <w:lang w:val="es-ES"/>
-        </w:rPr>
-        <w:t>loNo</w:t>
-      </w:r>
-      <w:proofErr w:type="spellEnd"/>
-      <w:r>
-        <w:rPr>
-          <w:lang w:val="es-ES"/>
-        </w:rPr>
-        <w:t xml:space="preserve"> utilicé nada más, salvo también una libreta para apuntar código.</w:t>
-      </w:r>
-      <w:r>
-        <w:rPr>
-          <w:lang w:val="es-ES"/>
-        </w:rPr>
-        <w:t xml:space="preserve"> Para ver el código completo junto a</w:t>
-      </w:r>
-      <w:r>
-        <w:rPr>
-          <w:lang w:val="es-ES"/>
-        </w:rPr>
-        <w:t xml:space="preserve"> imágenes y demás</w:t>
-      </w:r>
-      <w:r>
-        <w:rPr>
-          <w:lang w:val="es-ES"/>
-        </w:rPr>
-        <w:t xml:space="preserve"> materiales usados durante las prácticas para las tres actividades, se puede consultar el link en </w:t>
+        <w:t xml:space="preserve"> También me apoyé alguna que otra vez en IA para consultas (me dijo él que la usara, ya que le interesaba mi análisis más que loNo utilicé nada más, salvo también una libreta para apuntar código.</w:t>
+      </w:r>
+      <w:r>
+        <w:rPr>
+          <w:lang w:val="es-ES"/>
+        </w:rPr>
+        <w:t xml:space="preserve"> Para ver el código completo junto a imágenes y demás materiales usados durante las prácticas para las tres actividades, se puede consultar el link en </w:t>
       </w:r>
       <w:hyperlink w:anchor="_Bibliografía" w:history="1">
         <w:r>
@@ -4787,116 +4293,25 @@
         <w:rPr>
           <w:lang w:val="es-ES"/>
         </w:rPr>
-        <w:t xml:space="preserve">La ciencia de datos (data </w:t>
-      </w:r>
-      <w:proofErr w:type="spellStart"/>
-      <w:r>
-        <w:rPr>
-          <w:lang w:val="es-ES"/>
-        </w:rPr>
-        <w:t>science</w:t>
-      </w:r>
-      <w:proofErr w:type="spellEnd"/>
-      <w:r>
-        <w:rPr>
-          <w:lang w:val="es-ES"/>
-        </w:rPr>
-        <w:t xml:space="preserve">) es una ciencia interdisciplinar que se nutre y utiliza múltiples áreas de conocimiento como la estadística, la programación e incluso otras ramas de la informática en combinación con la información que recibe del entorno de interés (una consultoría, un laboratorio que trabaja con datos biológicos, una industria cárnica, etc.) para </w:t>
+        <w:t xml:space="preserve">La ciencia de datos (data science) es una ciencia interdisciplinar que se nutre y utiliza múltiples áreas de conocimiento como la estadística, la programación e incluso otras ramas de la informática en combinación con la información que recibe del entorno de interés (una consultoría, un laboratorio que trabaja con datos biológicos, una industria cárnica, etc.) para </w:t>
       </w:r>
       <w:r>
         <w:rPr>
           <w:lang w:val="es-ES"/>
         </w:rPr>
         <w:lastRenderedPageBreak/>
-        <w:t xml:space="preserve">entender, procesar, analizar y extraer conclusiones sobre los datos recogidos de dicho entorno. El científico de datos (data </w:t>
-      </w:r>
-      <w:proofErr w:type="spellStart"/>
-      <w:r>
-        <w:rPr>
-          <w:lang w:val="es-ES"/>
-        </w:rPr>
-        <w:t>scientist</w:t>
-      </w:r>
-      <w:proofErr w:type="spellEnd"/>
-      <w:r>
-        <w:rPr>
-          <w:lang w:val="es-ES"/>
-        </w:rPr>
-        <w:t>), básicamente, se encarga de manejar y crear código utilizando conocimientos de informática y matemáticas para no solo analizar esos datos, sino llegar a sus propias conclusiones y sugerir y contestar a nuevas preguntas sobre el objeto de interés.</w:t>
-      </w:r>
-    </w:p>
-    <w:p>
-      <w:r>
-        <w:rPr>
-          <w:lang w:val="es-ES"/>
-        </w:rPr>
-        <w:t xml:space="preserve">Un analista de datos (data </w:t>
-      </w:r>
-      <w:proofErr w:type="spellStart"/>
-      <w:r>
-        <w:rPr>
-          <w:lang w:val="es-ES"/>
-        </w:rPr>
-        <w:t>analyst</w:t>
-      </w:r>
-      <w:proofErr w:type="spellEnd"/>
-      <w:r>
-        <w:rPr>
-          <w:lang w:val="es-ES"/>
-        </w:rPr>
-        <w:t xml:space="preserve">) también se encarga de procesar y analizar información para responder a preguntas a partir de un proceso de selección y análisis de datos. Sin embargo, las diferencias son claras entre el trabajo que realiza un data </w:t>
-      </w:r>
-      <w:proofErr w:type="spellStart"/>
-      <w:r>
-        <w:rPr>
-          <w:lang w:val="es-ES"/>
-        </w:rPr>
-        <w:t>analyst</w:t>
-      </w:r>
-      <w:proofErr w:type="spellEnd"/>
-      <w:r>
-        <w:rPr>
-          <w:lang w:val="es-ES"/>
-        </w:rPr>
-        <w:t xml:space="preserve"> y el trabajo que realiza un data </w:t>
-      </w:r>
-      <w:proofErr w:type="spellStart"/>
-      <w:r>
-        <w:rPr>
-          <w:lang w:val="es-ES"/>
-        </w:rPr>
-        <w:t>scientist</w:t>
-      </w:r>
-      <w:proofErr w:type="spellEnd"/>
-      <w:r>
-        <w:rPr>
-          <w:lang w:val="es-ES"/>
-        </w:rPr>
-        <w:t xml:space="preserve">. Es más, en muchas empresas suelen convivir ambos tipos de especialistas que tienen focalizaciones distintas. </w:t>
-      </w:r>
-      <w:proofErr w:type="spellStart"/>
-      <w:r>
-        <w:t>Vemos</w:t>
-      </w:r>
-      <w:proofErr w:type="spellEnd"/>
-      <w:r>
-        <w:t xml:space="preserve"> las </w:t>
-      </w:r>
-      <w:proofErr w:type="spellStart"/>
-      <w:r>
-        <w:t>principales</w:t>
-      </w:r>
-      <w:proofErr w:type="spellEnd"/>
-      <w:r>
-        <w:t xml:space="preserve"> </w:t>
-      </w:r>
-      <w:proofErr w:type="spellStart"/>
-      <w:r>
-        <w:t>diferencias</w:t>
-      </w:r>
-      <w:proofErr w:type="spellEnd"/>
-      <w:r>
-        <w:t>:</w:t>
+        <w:t>entender, procesar, analizar y extraer conclusiones sobre los datos recogidos de dicho entorno. El científico de datos (data scientist), básicamente, se encarga de manejar y crear código utilizando conocimientos de informática y matemáticas para no solo analizar esos datos, sino llegar a sus propias conclusiones y sugerir y contestar a nuevas preguntas sobre el objeto de interés.</w:t>
+      </w:r>
+    </w:p>
+    <w:p>
+      <w:r>
+        <w:rPr>
+          <w:lang w:val="es-ES"/>
+        </w:rPr>
+        <w:t xml:space="preserve">Un analista de datos (data analyst) también se encarga de procesar y analizar información para responder a preguntas a partir de un proceso de selección y análisis de datos. Sin embargo, las diferencias son claras entre el trabajo que realiza un data analyst y el trabajo que realiza un data scientist. Es más, en muchas empresas suelen convivir ambos tipos de especialistas que tienen focalizaciones distintas. </w:t>
+      </w:r>
+      <w:r>
+        <w:t>Vemos las principales diferencias:</w:t>
       </w:r>
     </w:p>
     <w:p>
@@ -4913,35 +4328,7 @@
         <w:rPr>
           <w:lang w:val="es-ES"/>
         </w:rPr>
-        <w:t xml:space="preserve">En primer lugar, el data </w:t>
-      </w:r>
-      <w:proofErr w:type="spellStart"/>
-      <w:r>
-        <w:rPr>
-          <w:lang w:val="es-ES"/>
-        </w:rPr>
-        <w:t>analyst</w:t>
-      </w:r>
-      <w:proofErr w:type="spellEnd"/>
-      <w:r>
-        <w:rPr>
-          <w:lang w:val="es-ES"/>
-        </w:rPr>
-        <w:t xml:space="preserve"> normalmente solo responde a las preguntas que se le ofrecen en ese entorno de trabajo. Es decir, procesa y analiza los datos para obtener respuestas a las preguntas concretas que la empresa le encarga. Sin embargo, el data </w:t>
-      </w:r>
-      <w:proofErr w:type="spellStart"/>
-      <w:r>
-        <w:rPr>
-          <w:lang w:val="es-ES"/>
-        </w:rPr>
-        <w:t>scientist</w:t>
-      </w:r>
-      <w:proofErr w:type="spellEnd"/>
-      <w:r>
-        <w:rPr>
-          <w:lang w:val="es-ES"/>
-        </w:rPr>
-        <w:t xml:space="preserve"> va más allá y es capaz de entender la información de manera no tanto descriptiva sino para ser capaz de derivar nuevas preguntas a futuro.</w:t>
+        <w:t>En primer lugar, el data analyst normalmente solo responde a las preguntas que se le ofrecen en ese entorno de trabajo. Es decir, procesa y analiza los datos para obtener respuestas a las preguntas concretas que la empresa le encarga. Sin embargo, el data scientist va más allá y es capaz de entender la información de manera no tanto descriptiva sino para ser capaz de derivar nuevas preguntas a futuro.</w:t>
       </w:r>
     </w:p>
     <w:p>
@@ -4958,120 +4345,21 @@
         <w:rPr>
           <w:lang w:val="es-ES"/>
         </w:rPr>
-        <w:t xml:space="preserve">Por otro lado, en relación a lo anterior, el data </w:t>
-      </w:r>
-      <w:proofErr w:type="spellStart"/>
-      <w:r>
-        <w:rPr>
-          <w:lang w:val="es-ES"/>
-        </w:rPr>
-        <w:t>analyst</w:t>
-      </w:r>
-      <w:proofErr w:type="spellEnd"/>
-      <w:r>
-        <w:rPr>
-          <w:lang w:val="es-ES"/>
-        </w:rPr>
-        <w:t xml:space="preserve"> se centra más en lo que respecta a análisis descriptivo, visualización de datos y la identificación de patrones o tendencias para responder a esas preguntas (por ejemplo, hacer regresiones lineales o logísticas o un ANOVA/MANOVA de forma detallada para ver patrones, tendencias o interacciones entre datos). En cambio, el data </w:t>
-      </w:r>
-      <w:proofErr w:type="spellStart"/>
-      <w:r>
-        <w:rPr>
-          <w:lang w:val="es-ES"/>
-        </w:rPr>
-        <w:t>scientist</w:t>
-      </w:r>
-      <w:proofErr w:type="spellEnd"/>
-      <w:r>
-        <w:rPr>
-          <w:lang w:val="es-ES"/>
-        </w:rPr>
-        <w:t xml:space="preserve">, debido a su enfoque más amplio, se centra más en análisis predictivo, modelización de datos, machine </w:t>
-      </w:r>
-      <w:proofErr w:type="spellStart"/>
-      <w:r>
-        <w:rPr>
-          <w:lang w:val="es-ES"/>
-        </w:rPr>
-        <w:t>learning</w:t>
-      </w:r>
-      <w:proofErr w:type="spellEnd"/>
-      <w:r>
-        <w:rPr>
-          <w:lang w:val="es-ES"/>
-        </w:rPr>
-        <w:t xml:space="preserve"> </w:t>
-      </w:r>
-      <w:proofErr w:type="gramStart"/>
-      <w:r>
-        <w:rPr>
-          <w:lang w:val="es-ES"/>
-        </w:rPr>
-        <w:t>y</w:t>
-      </w:r>
-      <w:proofErr w:type="gramEnd"/>
-      <w:r>
-        <w:rPr>
-          <w:lang w:val="es-ES"/>
-        </w:rPr>
-        <w:t xml:space="preserve"> sobre todo, en la generación de paquetes y software para ser usado a posteriori de ser necesario, reutilizando la información y los modelos para ser usados a futuro.</w:t>
-      </w:r>
-    </w:p>
-    <w:p>
-      <w:pPr>
-        <w:rPr>
-          <w:lang w:val="es-ES"/>
-        </w:rPr>
-      </w:pPr>
-      <w:r>
-        <w:rPr>
-          <w:lang w:val="es-ES"/>
-        </w:rPr>
-        <w:t xml:space="preserve">Así, mientras que el data </w:t>
-      </w:r>
-      <w:proofErr w:type="spellStart"/>
-      <w:r>
-        <w:rPr>
-          <w:lang w:val="es-ES"/>
-        </w:rPr>
-        <w:t>analyst</w:t>
-      </w:r>
-      <w:proofErr w:type="spellEnd"/>
-      <w:r>
-        <w:rPr>
-          <w:lang w:val="es-ES"/>
-        </w:rPr>
-        <w:t xml:space="preserve"> no se sale tanto de su enfoque estadístico-matemático para ofrecer </w:t>
-      </w:r>
-      <w:proofErr w:type="spellStart"/>
-      <w:r>
-        <w:rPr>
-          <w:lang w:val="es-ES"/>
-        </w:rPr>
-        <w:t>insights</w:t>
-      </w:r>
-      <w:proofErr w:type="spellEnd"/>
-      <w:r>
-        <w:rPr>
-          <w:lang w:val="es-ES"/>
-        </w:rPr>
-        <w:t xml:space="preserve"> sobre los datos, el data </w:t>
-      </w:r>
-      <w:proofErr w:type="spellStart"/>
-      <w:r>
-        <w:rPr>
-          <w:lang w:val="es-ES"/>
-        </w:rPr>
-        <w:t>scientist</w:t>
-      </w:r>
-      <w:proofErr w:type="spellEnd"/>
-      <w:r>
-        <w:rPr>
-          <w:lang w:val="es-ES"/>
-        </w:rPr>
-        <w:t xml:space="preserve"> enfoca el problema desde una perspectiva más a futuro creando software que le pueda servir a la persona/empresa interesada, transformando los datos en modelos complejos para plantear otras preguntas, incluso por el </w:t>
-      </w:r>
-      <w:proofErr w:type="gramStart"/>
+        <w:t>Por otro lado, en relación a lo anterior, el data analyst se centra más en lo que respecta a análisis descriptivo, visualización de datos y la identificación de patrones o tendencias para responder a esas preguntas (por ejemplo, hacer regresiones lineales o logísticas o un ANOVA/MANOVA de forma detallada para ver patrones, tendencias o interacciones entre datos). En cambio, el data scientist, debido a su enfoque más amplio, se centra más en análisis predictivo, modelización de datos, machine learning y sobre todo, en la generación de paquetes y software para ser usado a posteriori de ser necesario, reutilizando la información y los modelos para ser usados a futuro.</w:t>
+      </w:r>
+    </w:p>
+    <w:p>
+      <w:pPr>
+        <w:rPr>
+          <w:lang w:val="es-ES"/>
+        </w:rPr>
+      </w:pPr>
+      <w:r>
+        <w:rPr>
+          <w:lang w:val="es-ES"/>
+        </w:rPr>
+        <w:t xml:space="preserve">Así, mientras que el data analyst no se sale tanto de su enfoque estadístico-matemático para ofrecer insights sobre los datos, el data scientist enfoca el problema desde una perspectiva más a futuro creando software que le pueda servir a la persona/empresa interesada, transformando los datos en modelos complejos para plantear otras preguntas, incluso por el </w:t>
+      </w:r>
       <w:r>
         <w:rPr>
           <w:lang w:val="es-ES"/>
@@ -5090,137 +4378,80 @@
         </w:rPr>
         <w:t xml:space="preserve"> data</w:t>
       </w:r>
-      <w:proofErr w:type="gramEnd"/>
-      <w:r>
-        <w:rPr>
-          <w:lang w:val="es-ES"/>
-        </w:rPr>
-        <w:t xml:space="preserve"> </w:t>
-      </w:r>
-      <w:proofErr w:type="spellStart"/>
-      <w:r>
-        <w:rPr>
-          <w:lang w:val="es-ES"/>
-        </w:rPr>
-        <w:t>scientist</w:t>
-      </w:r>
-      <w:proofErr w:type="spellEnd"/>
+      <w:r>
+        <w:rPr>
+          <w:lang w:val="es-ES"/>
+        </w:rPr>
+        <w:t xml:space="preserve"> scientist.</w:t>
+      </w:r>
+    </w:p>
+    <w:p>
+      <w:pPr>
+        <w:pStyle w:val="Ttulo3"/>
+        <w:rPr>
+          <w:lang w:val="es-ES"/>
+        </w:rPr>
+      </w:pPr>
+      <w:bookmarkStart w:id="9" w:name="_Toc208536924"/>
+      <w:r>
+        <w:rPr>
+          <w:lang w:val="es-ES"/>
+        </w:rPr>
+        <w:t>Tarea del tutor: describir poder estadístico y hacer unas pruebas</w:t>
+      </w:r>
+      <w:bookmarkEnd w:id="9"/>
+    </w:p>
+    <w:p>
+      <w:pPr>
+        <w:rPr>
+          <w:lang w:val="es-ES"/>
+        </w:rPr>
+      </w:pPr>
+      <w:r>
+        <w:rPr>
+          <w:lang w:val="es-ES"/>
+        </w:rPr>
+        <w:t>El poder estadístico o la potencia estadística de un test (suponemos no aleatorizado) mide la capacidad de un test de detectar errores de tipo II, es decir, la probabilidad de aceptar la hipótesis nula H0 (que conocemos) dado que H0 es falsa.</w:t>
+      </w:r>
+    </w:p>
+    <w:p>
+      <w:pPr>
+        <w:rPr>
+          <w:lang w:val="es-ES"/>
+        </w:rPr>
+      </w:pPr>
+      <w:r>
+        <w:rPr>
+          <w:lang w:val="es-ES"/>
+        </w:rPr>
+        <w:t xml:space="preserve">En otras palabras, el poder estadístico mide la capacidad de un estudio para identificar un efecto de estar este presente. Un poder estadístico bajo quiere decir que existe un mayor riesgo de no detectar efectos reales por lo anteriormente dicho, lo que puede llevar a una conclusión errónea. Por eso, en investigación y análisis de laboratorio, se suele buscar un poder estadístico mínimo de 0,80 (80%), lo que implica que hay un 80% de probabilidad de detectar un efecto si realmente existe, aunque dependiendo de la viabilidad de hacer más o menos réplicas independientes del experimento para cada grupo, podremos aceptar poderes estadísticos de 0,60-0,70 (menos de 0,50 en general no, aunque en algunos estudios no se suele hacer un análisis de poder previo al estudio y se aceptan poderes bajos), también dependerá de cuán formal queramos que sea el estudio. Aquí, por cómo es nuestro estudio (una probatina de laboratorio sencilla), hemos considerado un poder de 0,75 (cerca a 0,80) sin problemas, si bien como veremos es recomendable utilizar n &gt; 30 ya que en tal caso en general </w:t>
+      </w:r>
+      <w:r>
+        <w:rPr>
+          <w:lang w:val="es-ES"/>
+        </w:rPr>
+        <w:lastRenderedPageBreak/>
+        <w:t>la distribución de los datos intergrupo (las réplicas) aproxima bien a una distribución normal (podremos suponer normalidad). El efecto a priori queremos que sea alto normalmente porque no solo queremos que el fármaco tenga algún efecto en la germinación, sino que queremos que el fármaco en cuestión tenga mucho efecto en esta.</w:t>
+      </w:r>
+    </w:p>
+    <w:p>
+      <w:pPr>
+        <w:rPr>
+          <w:lang w:val="es-ES"/>
+        </w:rPr>
+      </w:pPr>
+      <w:r>
+        <w:rPr>
+          <w:lang w:val="es-ES"/>
+        </w:rPr>
+        <w:t>Así, lo que hemos estudiado primeramente es el tamaño mínimo de muestra necesario para detectar un efecto de interés con una probabilidad adecuada. Aquí se muestra la gráfica para varios f desde 0.25 a 0.45 y poder de 0</w:t>
+      </w:r>
       <w:r>
         <w:rPr>
           <w:lang w:val="es-ES"/>
         </w:rPr>
         <w:t>.</w:t>
       </w:r>
-    </w:p>
-    <w:p>
-      <w:pPr>
-        <w:pStyle w:val="Ttulo3"/>
-        <w:rPr>
-          <w:lang w:val="es-ES"/>
-        </w:rPr>
-      </w:pPr>
-      <w:bookmarkStart w:id="9" w:name="_Toc208536924"/>
-      <w:r>
-        <w:rPr>
-          <w:lang w:val="es-ES"/>
-        </w:rPr>
-        <w:t>Tarea del tutor: describir poder estadístico y hacer unas pruebas</w:t>
-      </w:r>
-      <w:bookmarkEnd w:id="9"/>
-    </w:p>
-    <w:p>
-      <w:pPr>
-        <w:rPr>
-          <w:lang w:val="es-ES"/>
-        </w:rPr>
-      </w:pPr>
-      <w:r>
-        <w:rPr>
-          <w:lang w:val="es-ES"/>
-        </w:rPr>
-        <w:t>El poder estadístico o la potencia estadística de un test (suponemos no aleatorizado) mide la capacidad de un test de detectar errores de tipo II, es decir, la probabilidad de aceptar la hipótesis nula H0 (que conocemos) dado que H0 es falsa.</w:t>
-      </w:r>
-    </w:p>
-    <w:p>
-      <w:pPr>
-        <w:rPr>
-          <w:lang w:val="es-ES"/>
-        </w:rPr>
-      </w:pPr>
-      <w:r>
-        <w:rPr>
-          <w:lang w:val="es-ES"/>
-        </w:rPr>
-        <w:t xml:space="preserve">En otras palabras, el poder estadístico mide la capacidad de un estudio para identificar un efecto de estar este presente. Un poder estadístico bajo quiere decir que existe un mayor riesgo de no detectar efectos reales por lo anteriormente dicho, lo que puede llevar a una conclusión errónea. Por eso, en investigación y análisis de laboratorio, se suele buscar un poder estadístico mínimo de 0,80 (80%), lo que implica que hay un 80% de probabilidad de detectar un efecto si realmente existe, aunque dependiendo de la viabilidad de hacer más o menos réplicas independientes del experimento para cada grupo, podremos aceptar poderes estadísticos de 0,60-0,70 (menos de 0,50 en general no, aunque en algunos estudios no se suele hacer un análisis de poder previo al estudio y se aceptan poderes bajos), también dependerá de cuán formal queramos que sea el estudio. Aquí, por cómo es nuestro estudio (una </w:t>
-      </w:r>
-      <w:proofErr w:type="spellStart"/>
-      <w:r>
-        <w:rPr>
-          <w:lang w:val="es-ES"/>
-        </w:rPr>
-        <w:t>probatina</w:t>
-      </w:r>
-      <w:proofErr w:type="spellEnd"/>
-      <w:r>
-        <w:rPr>
-          <w:lang w:val="es-ES"/>
-        </w:rPr>
-        <w:t xml:space="preserve"> de laboratorio sencilla), hemos considerado un poder de 0,75 (</w:t>
-      </w:r>
-      <w:proofErr w:type="spellStart"/>
-      <w:r>
-        <w:rPr>
-          <w:lang w:val="es-ES"/>
-        </w:rPr>
-        <w:t>cerca a</w:t>
-      </w:r>
-      <w:proofErr w:type="spellEnd"/>
-      <w:r>
-        <w:rPr>
-          <w:lang w:val="es-ES"/>
-        </w:rPr>
-        <w:t xml:space="preserve"> 0,80) sin problemas, si bien como veremos es recomendable utilizar n &gt; 30 ya que en tal caso en general </w:t>
-      </w:r>
-      <w:r>
-        <w:rPr>
-          <w:lang w:val="es-ES"/>
-        </w:rPr>
-        <w:lastRenderedPageBreak/>
-        <w:t xml:space="preserve">la distribución de los datos </w:t>
-      </w:r>
-      <w:proofErr w:type="spellStart"/>
-      <w:r>
-        <w:rPr>
-          <w:lang w:val="es-ES"/>
-        </w:rPr>
-        <w:t>intergrupo</w:t>
-      </w:r>
-      <w:proofErr w:type="spellEnd"/>
-      <w:r>
-        <w:rPr>
-          <w:lang w:val="es-ES"/>
-        </w:rPr>
-        <w:t xml:space="preserve"> (las réplicas) aproxima bien a una distribución normal (podremos suponer normalidad). El efecto a priori queremos que sea alto normalmente porque no solo queremos que el fármaco tenga algún efecto en la germinación, sino que queremos que el fármaco en cuestión tenga mucho efecto en esta.</w:t>
-      </w:r>
-    </w:p>
-    <w:p>
-      <w:pPr>
-        <w:rPr>
-          <w:lang w:val="es-ES"/>
-        </w:rPr>
-      </w:pPr>
-      <w:r>
-        <w:rPr>
-          <w:lang w:val="es-ES"/>
-        </w:rPr>
-        <w:t>Así, lo que hemos estudiado primeramente es el tamaño mínimo de muestra necesario para detectar un efecto de interés con una probabilidad adecuada. Aquí se muestra la gráfica para varios f desde 0.25 a 0.45 y poder de 0</w:t>
-      </w:r>
-      <w:r>
-        <w:rPr>
-          <w:lang w:val="es-ES"/>
-        </w:rPr>
-        <w:t>.</w:t>
-      </w:r>
       <w:r>
         <w:rPr>
           <w:lang w:val="es-ES"/>
@@ -5237,41 +4468,13 @@
         <w:rPr>
           <w:lang w:val="es-ES"/>
         </w:rPr>
-        <w:t xml:space="preserve"> un </w:t>
-      </w:r>
-      <w:proofErr w:type="spellStart"/>
-      <w:r>
-        <w:rPr>
-          <w:lang w:val="es-ES"/>
-        </w:rPr>
-        <w:t>one-way</w:t>
-      </w:r>
-      <w:proofErr w:type="spellEnd"/>
-      <w:r>
-        <w:rPr>
-          <w:lang w:val="es-ES"/>
-        </w:rPr>
-        <w:t xml:space="preserve"> ANOVA, que es lo que queremos estudiar.</w:t>
-      </w:r>
-      <w:r>
-        <w:rPr>
-          <w:lang w:val="es-ES"/>
-        </w:rPr>
-        <w:t xml:space="preserve"> Hemos utilizado la herramienta G*</w:t>
-      </w:r>
-      <w:proofErr w:type="spellStart"/>
-      <w:r>
-        <w:rPr>
-          <w:lang w:val="es-ES"/>
-        </w:rPr>
-        <w:t>Power</w:t>
-      </w:r>
-      <w:proofErr w:type="spellEnd"/>
-      <w:r>
-        <w:rPr>
-          <w:lang w:val="es-ES"/>
-        </w:rPr>
-        <w:t xml:space="preserve"> para estudiar el poder estadístico, junto a R:</w:t>
+        <w:t xml:space="preserve"> un one-way ANOVA, que es lo que queremos estudiar.</w:t>
+      </w:r>
+      <w:r>
+        <w:rPr>
+          <w:lang w:val="es-ES"/>
+        </w:rPr>
+        <w:t xml:space="preserve"> Hemos utilizado la herramienta G*Power para estudiar el poder estadístico, junto a R:</w:t>
       </w:r>
     </w:p>
     <w:p>
@@ -5381,21 +4584,7 @@
         <w:rPr>
           <w:lang w:val="es-ES"/>
         </w:rPr>
-        <w:t>Nuestra N (número total de réplicas independientes) es aproximadamente N = 81 según la gráfica en G*</w:t>
-      </w:r>
-      <w:proofErr w:type="spellStart"/>
-      <w:r>
-        <w:rPr>
-          <w:lang w:val="es-ES"/>
-        </w:rPr>
-        <w:t>Power</w:t>
-      </w:r>
-      <w:proofErr w:type="spellEnd"/>
-      <w:r>
-        <w:rPr>
-          <w:lang w:val="es-ES"/>
-        </w:rPr>
-        <w:t xml:space="preserve"> para f = 0,45 y 1-</w:t>
+        <w:t>Nuestra N (número total de réplicas independientes) es aproximadamente N = 81 según la gráfica en G*Power para f = 0,45 y 1-</w:t>
       </w:r>
       <w:r>
         <w:t>β</w:t>
@@ -5404,21 +4593,7 @@
         <w:rPr>
           <w:lang w:val="es-ES"/>
         </w:rPr>
-        <w:t xml:space="preserve"> = 0,75 (el poder). Si lo hacemos en R, nos devuelve el número de réplicas por grupo que tenemos que tomar, que da n = 8,35, que redondeado hacia arriba es n = 9, que coincide con el análisis que hace G*</w:t>
-      </w:r>
-      <w:proofErr w:type="spellStart"/>
-      <w:r>
-        <w:rPr>
-          <w:lang w:val="es-ES"/>
-        </w:rPr>
-        <w:t>Power</w:t>
-      </w:r>
-      <w:proofErr w:type="spellEnd"/>
-      <w:r>
-        <w:rPr>
-          <w:lang w:val="es-ES"/>
-        </w:rPr>
-        <w:t>, con un efecto de f = 0,45 (muy alto, alto se considera en general más de 0,4).</w:t>
+        <w:t xml:space="preserve"> = 0,75 (el poder). Si lo hacemos en R, nos devuelve el número de réplicas por grupo que tenemos que tomar, que da n = 8,35, que redondeado hacia arriba es n = 9, que coincide con el análisis que hace G*Power, con un efecto de f = 0,45 (muy alto, alto se considera en general más de 0,4).</w:t>
       </w:r>
       <w:r>
         <w:rPr>
@@ -5433,6 +4608,7 @@
       </w:pPr>
       <w:r>
         <w:rPr>
+          <w:noProof/>
           <w:lang w:val="es-ES"/>
         </w:rPr>
         <w:drawing>
@@ -5598,21 +4774,7 @@
         <w:rPr>
           <w:lang w:val="es-ES"/>
         </w:rPr>
-        <w:t xml:space="preserve"> (8 h, 24 h) sobre </w:t>
-      </w:r>
-      <w:proofErr w:type="spellStart"/>
-      <w:r>
-        <w:rPr>
-          <w:lang w:val="es-ES"/>
-        </w:rPr>
-        <w:t>el</w:t>
-      </w:r>
-      <w:proofErr w:type="spellEnd"/>
-      <w:r>
-        <w:rPr>
-          <w:lang w:val="es-ES"/>
-        </w:rPr>
-        <w:t xml:space="preserve"> </w:t>
+        <w:t xml:space="preserve"> (8 h, 24 h) sobre el </w:t>
       </w:r>
       <w:r>
         <w:rPr>
@@ -5771,37 +4933,7 @@
         <w:rPr>
           <w:lang w:val="es-ES"/>
         </w:rPr>
-        <w:t xml:space="preserve"> estudiofarmaco.txt (</w:t>
-      </w:r>
-      <w:proofErr w:type="spellStart"/>
-      <w:r>
-        <w:rPr>
-          <w:lang w:val="es-ES"/>
-        </w:rPr>
-        <w:t>tab</w:t>
-      </w:r>
-      <w:proofErr w:type="spellEnd"/>
-      <w:r>
-        <w:rPr>
-          <w:lang w:val="es-ES"/>
-        </w:rPr>
-        <w:t xml:space="preserve">); </w:t>
-      </w:r>
-      <w:proofErr w:type="spellStart"/>
-      <w:proofErr w:type="gramStart"/>
-      <w:r>
-        <w:rPr>
-          <w:lang w:val="es-ES"/>
-        </w:rPr>
-        <w:t>na.omit</w:t>
-      </w:r>
-      <w:proofErr w:type="spellEnd"/>
-      <w:proofErr w:type="gramEnd"/>
-      <w:r>
-        <w:rPr>
-          <w:lang w:val="es-ES"/>
-        </w:rPr>
-        <w:t xml:space="preserve">; si %&gt;100 </w:t>
+        <w:t xml:space="preserve"> estudiofarmaco.txt (tab); na.omit; si %&gt;100 </w:t>
       </w:r>
       <w:r>
         <w:rPr>
@@ -5814,49 +4946,7 @@
         <w:rPr>
           <w:lang w:val="es-ES"/>
         </w:rPr>
-        <w:t xml:space="preserve"> /10; factores: </w:t>
-      </w:r>
-      <w:proofErr w:type="spellStart"/>
-      <w:r>
-        <w:rPr>
-          <w:lang w:val="es-ES"/>
-        </w:rPr>
-        <w:t>trt</w:t>
-      </w:r>
-      <w:proofErr w:type="spellEnd"/>
-      <w:r>
-        <w:rPr>
-          <w:lang w:val="es-ES"/>
-        </w:rPr>
-        <w:t xml:space="preserve"> (9 niveles) y </w:t>
-      </w:r>
-      <w:proofErr w:type="spellStart"/>
-      <w:r>
-        <w:rPr>
-          <w:lang w:val="es-ES"/>
-        </w:rPr>
-        <w:t>trtf</w:t>
-      </w:r>
-      <w:proofErr w:type="spellEnd"/>
-      <w:r>
-        <w:rPr>
-          <w:lang w:val="es-ES"/>
-        </w:rPr>
-        <w:t xml:space="preserve"> = </w:t>
-      </w:r>
-      <w:proofErr w:type="spellStart"/>
-      <w:r>
-        <w:rPr>
-          <w:lang w:val="es-ES"/>
-        </w:rPr>
-        <w:t>trt×time</w:t>
-      </w:r>
-      <w:proofErr w:type="spellEnd"/>
-      <w:r>
-        <w:rPr>
-          <w:lang w:val="es-ES"/>
-        </w:rPr>
-        <w:t>; subconjuntos: 8 h y 24 h.</w:t>
+        <w:t xml:space="preserve"> /10; factores: trt (9 niveles) y trtf = trt×time; subconjuntos: 8 h y 24 h.</w:t>
       </w:r>
     </w:p>
     <w:p>
@@ -5871,23 +4961,7 @@
           <w:bCs/>
           <w:lang w:val="es-ES"/>
         </w:rPr>
-        <w:t>Esquema del m</w:t>
-      </w:r>
-      <w:r>
-        <w:rPr>
-          <w:b/>
-          <w:bCs/>
-          <w:lang w:val="es-ES"/>
-        </w:rPr>
-        <w:t>étodo</w:t>
-      </w:r>
-      <w:r>
-        <w:rPr>
-          <w:b/>
-          <w:bCs/>
-          <w:lang w:val="es-ES"/>
-        </w:rPr>
-        <w:t xml:space="preserve"> que hemos usado</w:t>
+        <w:t>Esquema del método que hemos usado</w:t>
       </w:r>
       <w:r>
         <w:rPr>
@@ -5928,21 +5002,7 @@
         <w:rPr>
           <w:lang w:val="es-ES"/>
         </w:rPr>
-        <w:t xml:space="preserve"> sobre </w:t>
-      </w:r>
-      <w:proofErr w:type="spellStart"/>
-      <w:r>
-        <w:rPr>
-          <w:lang w:val="es-ES"/>
-        </w:rPr>
-        <w:t>trtf</w:t>
-      </w:r>
-      <w:proofErr w:type="spellEnd"/>
-      <w:r>
-        <w:rPr>
-          <w:lang w:val="es-ES"/>
-        </w:rPr>
-        <w:t>.</w:t>
+        <w:t xml:space="preserve"> sobre trtf.</w:t>
       </w:r>
     </w:p>
     <w:p>
@@ -5967,18 +5027,8 @@
           <w:bCs/>
           <w:lang w:val="es-ES"/>
         </w:rPr>
-        <w:t>Shapiro–</w:t>
-      </w:r>
-      <w:proofErr w:type="spellStart"/>
-      <w:r>
-        <w:rPr>
-          <w:b/>
-          <w:bCs/>
-          <w:lang w:val="es-ES"/>
-        </w:rPr>
-        <w:t>Wilk</w:t>
-      </w:r>
-      <w:proofErr w:type="spellEnd"/>
+        <w:t>Shapiro–Wilk</w:t>
+      </w:r>
       <w:r>
         <w:rPr>
           <w:lang w:val="es-ES"/>
@@ -6086,21 +5136,7 @@
         <w:rPr>
           <w:lang w:val="es-ES"/>
         </w:rPr>
-        <w:t xml:space="preserve"> de </w:t>
-      </w:r>
-      <w:proofErr w:type="spellStart"/>
-      <w:r>
-        <w:rPr>
-          <w:lang w:val="es-ES"/>
-        </w:rPr>
-        <w:t>X._germinados</w:t>
-      </w:r>
-      <w:proofErr w:type="spellEnd"/>
-      <w:r>
-        <w:rPr>
-          <w:lang w:val="es-ES"/>
-        </w:rPr>
-        <w:t>.</w:t>
+        <w:t xml:space="preserve"> de X._germinados.</w:t>
       </w:r>
     </w:p>
     <w:p>
@@ -6276,26 +5312,16 @@
           <w:bCs/>
           <w:lang w:val="es-ES"/>
         </w:rPr>
-        <w:t xml:space="preserve">Análisis </w:t>
-      </w:r>
-      <w:proofErr w:type="spellStart"/>
+        <w:t>Análisis p</w:t>
+      </w:r>
       <w:r>
         <w:rPr>
           <w:b/>
           <w:bCs/>
           <w:lang w:val="es-ES"/>
         </w:rPr>
-        <w:t>p</w:t>
-      </w:r>
-      <w:r>
-        <w:rPr>
-          <w:b/>
-          <w:bCs/>
-          <w:lang w:val="es-ES"/>
-        </w:rPr>
         <w:t>ost-hoc</w:t>
       </w:r>
-      <w:proofErr w:type="spellEnd"/>
       <w:r>
         <w:rPr>
           <w:b/>
@@ -6361,19 +5387,11 @@
         </w:rPr>
         <w:t xml:space="preserve">con la función </w:t>
       </w:r>
-      <w:proofErr w:type="spellStart"/>
-      <w:r>
-        <w:rPr>
-          <w:lang w:val="es-ES"/>
-        </w:rPr>
-        <w:t>multcompView</w:t>
-      </w:r>
-      <w:proofErr w:type="spellEnd"/>
-      <w:r>
-        <w:rPr>
-          <w:lang w:val="es-ES"/>
-        </w:rPr>
-        <w:t xml:space="preserve"> para </w:t>
+      <w:r>
+        <w:rPr>
+          <w:lang w:val="es-ES"/>
+        </w:rPr>
+        <w:t xml:space="preserve">multcompView para </w:t>
       </w:r>
       <w:r>
         <w:rPr>
@@ -6416,21 +5434,7 @@
         <w:rPr>
           <w:lang w:val="es-ES"/>
         </w:rPr>
-        <w:t xml:space="preserve"> </w:t>
-      </w:r>
-      <w:proofErr w:type="spellStart"/>
-      <w:r>
-        <w:rPr>
-          <w:lang w:val="es-ES"/>
-        </w:rPr>
-        <w:t>EtaSq</w:t>
-      </w:r>
-      <w:proofErr w:type="spellEnd"/>
-      <w:r>
-        <w:rPr>
-          <w:lang w:val="es-ES"/>
-        </w:rPr>
-        <w:t xml:space="preserve"> (</w:t>
+        <w:t xml:space="preserve"> EtaSq (</w:t>
       </w:r>
       <w:r>
         <w:t>η</w:t>
@@ -6468,35 +5472,7 @@
         <w:rPr>
           <w:lang w:val="es-ES"/>
         </w:rPr>
-        <w:t xml:space="preserve"> </w:t>
-      </w:r>
-      <w:proofErr w:type="spellStart"/>
-      <w:r>
-        <w:rPr>
-          <w:lang w:val="es-ES"/>
-        </w:rPr>
-        <w:t>Boxplot</w:t>
-      </w:r>
-      <w:proofErr w:type="spellEnd"/>
-      <w:r>
-        <w:rPr>
-          <w:lang w:val="es-ES"/>
-        </w:rPr>
-        <w:t xml:space="preserve"> y </w:t>
-      </w:r>
-      <w:proofErr w:type="spellStart"/>
-      <w:r>
-        <w:rPr>
-          <w:lang w:val="es-ES"/>
-        </w:rPr>
-        <w:t>violin</w:t>
-      </w:r>
-      <w:proofErr w:type="spellEnd"/>
-      <w:r>
-        <w:rPr>
-          <w:lang w:val="es-ES"/>
-        </w:rPr>
-        <w:t xml:space="preserve"> por tratamiento en 8 h y 24 h; </w:t>
+        <w:t xml:space="preserve"> Boxplot y violin por tratamiento en 8 h y 24 h; </w:t>
       </w:r>
       <w:r>
         <w:rPr>
@@ -6555,10 +5531,11 @@
         <w:rPr>
           <w:b/>
           <w:bCs/>
+          <w:noProof/>
         </w:rPr>
         <w:lastRenderedPageBreak/>
         <w:drawing>
-          <wp:inline distT="0" distB="0" distL="0" distR="0" wp14:anchorId="3F268A0A" wp14:editId="02B43C55">
+          <wp:inline distT="0" distB="0" distL="0" distR="0" wp14:anchorId="3F268A0A" wp14:editId="571E69CF">
             <wp:extent cx="5338398" cy="2914650"/>
             <wp:effectExtent l="0" t="0" r="0" b="0"/>
             <wp:docPr id="452097050" name="Imagen 40"/>
@@ -6647,21 +5624,7 @@
         <w:rPr>
           <w:lang w:val="es-ES"/>
         </w:rPr>
-        <w:t xml:space="preserve">: </w:t>
-      </w:r>
-      <w:proofErr w:type="spellStart"/>
-      <w:r>
-        <w:rPr>
-          <w:lang w:val="es-ES"/>
-        </w:rPr>
-        <w:t>Boxplot</w:t>
-      </w:r>
-      <w:proofErr w:type="spellEnd"/>
-      <w:r>
-        <w:rPr>
-          <w:lang w:val="es-ES"/>
-        </w:rPr>
-        <w:t xml:space="preserve"> </w:t>
+        <w:t xml:space="preserve">: Boxplot </w:t>
       </w:r>
       <w:r>
         <w:rPr>
@@ -6701,8 +5664,11 @@
         <w:keepNext/>
       </w:pPr>
       <w:r>
+        <w:rPr>
+          <w:noProof/>
+        </w:rPr>
         <w:drawing>
-          <wp:inline distT="0" distB="0" distL="0" distR="0" wp14:anchorId="0D092AAD" wp14:editId="1E5374CA">
+          <wp:inline distT="0" distB="0" distL="0" distR="0" wp14:anchorId="0D092AAD" wp14:editId="2D7AB27E">
             <wp:extent cx="5400040" cy="2924175"/>
             <wp:effectExtent l="0" t="0" r="0" b="9525"/>
             <wp:docPr id="816364192" name="Imagen 42"/>
@@ -6790,21 +5756,7 @@
         <w:rPr>
           <w:lang w:val="es-ES"/>
         </w:rPr>
-        <w:t xml:space="preserve">: </w:t>
-      </w:r>
-      <w:proofErr w:type="spellStart"/>
-      <w:r>
-        <w:rPr>
-          <w:lang w:val="es-ES"/>
-        </w:rPr>
-        <w:t>Boxplot</w:t>
-      </w:r>
-      <w:proofErr w:type="spellEnd"/>
-      <w:r>
-        <w:rPr>
-          <w:lang w:val="es-ES"/>
-        </w:rPr>
-        <w:t xml:space="preserve"> </w:t>
+        <w:t xml:space="preserve">: Boxplot </w:t>
       </w:r>
       <w:r>
         <w:rPr>
@@ -6822,25 +5774,7 @@
         <w:rPr>
           <w:lang w:val="es-ES"/>
         </w:rPr>
-        <w:t xml:space="preserve"> de grupos </w:t>
-      </w:r>
-      <w:r>
-        <w:rPr>
-          <w:lang w:val="es-ES"/>
-        </w:rPr>
-        <w:t>diferenciados</w:t>
-      </w:r>
-      <w:r>
-        <w:rPr>
-          <w:lang w:val="es-ES"/>
-        </w:rPr>
-        <w:t xml:space="preserve"> </w:t>
-      </w:r>
-      <w:r>
-        <w:rPr>
-          <w:lang w:val="es-ES"/>
-        </w:rPr>
-        <w:t xml:space="preserve">de forma estadísticamente significativa </w:t>
+        <w:t xml:space="preserve"> de grupos diferenciados de forma estadísticamente significativa </w:t>
       </w:r>
       <w:r>
         <w:rPr>
@@ -6882,37 +5816,8 @@
         <w:rPr>
           <w:lang w:val="es-ES"/>
         </w:rPr>
-        <w:t xml:space="preserve"> con respecto al control, vemos una diferencia de medias (la media de las réplicas por grupo) en </w:t>
-      </w:r>
-      <w:proofErr w:type="spellStart"/>
-      <w:r>
-        <w:rPr>
-          <w:lang w:val="es-ES"/>
-        </w:rPr>
-        <w:t>el</w:t>
-      </w:r>
-      <w:proofErr w:type="spellEnd"/>
-      <w:r>
-        <w:rPr>
-          <w:lang w:val="es-ES"/>
-        </w:rPr>
-        <w:t xml:space="preserve"> % de germinación estadísticamente significativa a partir de 10 µg/ml de </w:t>
-      </w:r>
-      <w:proofErr w:type="spellStart"/>
-      <w:r>
-        <w:rPr>
-          <w:lang w:val="es-ES"/>
-        </w:rPr>
-        <w:t>fármaco+DMSO</w:t>
-      </w:r>
-      <w:proofErr w:type="spellEnd"/>
-      <w:r>
-        <w:rPr>
-          <w:lang w:val="es-ES"/>
-        </w:rPr>
-        <w:t xml:space="preserve">. Sin embargo, el mayor efecto se alcanza con concentraciones de 20 y 30 µg/ml, pero puesto que no hay diferencia estadísticamente significativa de medias entre 20 y 30 µg/ml, recomendaría utilizar el </w:t>
-      </w:r>
-      <w:proofErr w:type="spellStart"/>
+        <w:t xml:space="preserve"> con respecto al control, vemos una diferencia de medias (la media de las réplicas por grupo) en el % de germinación estadísticamente significativa a partir de 10 µg/ml de fármaco+DMSO. Sin embargo, el mayor efecto se alcanza con concentraciones de 20 y 30 µg/ml, pero puesto que no hay diferencia estadísticamente significativa de medias entre 20 y 30 µg/ml, recomendaría utilizar el </w:t>
+      </w:r>
       <w:r>
         <w:rPr>
           <w:b/>
@@ -6921,7 +5826,6 @@
         </w:rPr>
         <w:t>fármaco+DMSO</w:t>
       </w:r>
-      <w:proofErr w:type="spellEnd"/>
       <w:r>
         <w:rPr>
           <w:lang w:val="es-ES"/>
@@ -6964,21 +5868,7 @@
         <w:rPr>
           <w:lang w:val="es-ES"/>
         </w:rPr>
-        <w:t xml:space="preserve">Asimismo, notamos que la diferencia de medias en </w:t>
-      </w:r>
-      <w:proofErr w:type="spellStart"/>
-      <w:r>
-        <w:rPr>
-          <w:lang w:val="es-ES"/>
-        </w:rPr>
-        <w:t>el</w:t>
-      </w:r>
-      <w:proofErr w:type="spellEnd"/>
-      <w:r>
-        <w:rPr>
-          <w:lang w:val="es-ES"/>
-        </w:rPr>
-        <w:t xml:space="preserve"> % de germinación </w:t>
+        <w:t xml:space="preserve">Asimismo, notamos que la diferencia de medias en el % de germinación </w:t>
       </w:r>
       <w:r>
         <w:rPr>
@@ -6992,21 +5882,7 @@
         <w:rPr>
           <w:lang w:val="es-ES"/>
         </w:rPr>
-        <w:t xml:space="preserve">. Esto es porque la diferencia de medias entre el control y la mezcla con DMSO puro 0.35% (sin fármaco) no es estadísticamente significativa, como se observa en el </w:t>
-      </w:r>
-      <w:proofErr w:type="spellStart"/>
-      <w:r>
-        <w:rPr>
-          <w:lang w:val="es-ES"/>
-        </w:rPr>
-        <w:t>boxplot</w:t>
-      </w:r>
-      <w:proofErr w:type="spellEnd"/>
-      <w:r>
-        <w:rPr>
-          <w:lang w:val="es-ES"/>
-        </w:rPr>
-        <w:t>.</w:t>
+        <w:t>. Esto es porque la diferencia de medias entre el control y la mezcla con DMSO puro 0.35% (sin fármaco) no es estadísticamente significativa, como se observa en el boxplot.</w:t>
       </w:r>
     </w:p>
     <w:p>
@@ -7188,54 +6064,20 @@
           <w:numId w:val="8"/>
         </w:numPr>
       </w:pPr>
-      <w:proofErr w:type="spellStart"/>
       <w:r>
         <w:rPr>
           <w:b/>
           <w:bCs/>
         </w:rPr>
-        <w:t>Hacemos</w:t>
-      </w:r>
-      <w:proofErr w:type="spellEnd"/>
+        <w:t xml:space="preserve">Hacemos un </w:t>
+      </w:r>
       <w:r>
         <w:rPr>
           <w:b/>
           <w:bCs/>
         </w:rPr>
-        <w:t xml:space="preserve"> </w:t>
-      </w:r>
-      <w:proofErr w:type="gramStart"/>
-      <w:r>
-        <w:rPr>
-          <w:b/>
-          <w:bCs/>
-        </w:rPr>
-        <w:t xml:space="preserve">un </w:t>
-      </w:r>
-      <w:r>
-        <w:rPr>
-          <w:b/>
-          <w:bCs/>
-        </w:rPr>
-        <w:t>ANOVA</w:t>
-      </w:r>
-      <w:proofErr w:type="gramEnd"/>
-      <w:r>
-        <w:rPr>
-          <w:b/>
-          <w:bCs/>
-        </w:rPr>
-        <w:t xml:space="preserve"> </w:t>
-      </w:r>
-      <w:proofErr w:type="spellStart"/>
-      <w:r>
-        <w:rPr>
-          <w:b/>
-          <w:bCs/>
-        </w:rPr>
-        <w:t>clásico</w:t>
-      </w:r>
-      <w:proofErr w:type="spellEnd"/>
+        <w:t>ANOVA clásico</w:t>
+      </w:r>
       <w:r>
         <w:rPr>
           <w:b/>
@@ -7285,21 +6127,12 @@
           <w:numId w:val="8"/>
         </w:numPr>
       </w:pPr>
-      <w:proofErr w:type="spellStart"/>
       <w:r>
         <w:rPr>
           <w:b/>
           <w:bCs/>
         </w:rPr>
-        <w:t>Modelos</w:t>
-      </w:r>
-      <w:proofErr w:type="spellEnd"/>
-      <w:r>
-        <w:rPr>
-          <w:b/>
-          <w:bCs/>
-        </w:rPr>
-        <w:t xml:space="preserve"> GLM</w:t>
+        <w:t>Modelos GLM</w:t>
       </w:r>
       <w:r>
         <w:rPr>
@@ -7446,14 +6279,12 @@
         </w:rPr>
         <w:t xml:space="preserve"> el paquete </w:t>
       </w:r>
-      <w:proofErr w:type="spellStart"/>
       <w:r>
         <w:rPr>
           <w:lang w:val="es-ES"/>
         </w:rPr>
         <w:t>DHARMa</w:t>
       </w:r>
-      <w:proofErr w:type="spellEnd"/>
       <w:r>
         <w:rPr>
           <w:lang w:val="es-ES"/>
@@ -7470,41 +6301,31 @@
         <w:rPr>
           <w:lang w:val="es-ES"/>
         </w:rPr>
+        <w:t xml:space="preserve"> DHARMa es un paquete de R que básicamente </w:t>
+      </w:r>
+      <w:r>
+        <w:rPr>
+          <w:lang w:val="es-ES"/>
+        </w:rPr>
+        <w:t>genera residuos cuantílicos escalados por simulación</w:t>
+      </w:r>
+      <w:r>
+        <w:rPr>
+          <w:lang w:val="es-ES"/>
+        </w:rPr>
         <w:t xml:space="preserve"> </w:t>
       </w:r>
-      <w:proofErr w:type="spellStart"/>
-      <w:r>
-        <w:rPr>
-          <w:lang w:val="es-ES"/>
-        </w:rPr>
-        <w:t>DHARMa</w:t>
-      </w:r>
-      <w:proofErr w:type="spellEnd"/>
-      <w:r>
-        <w:rPr>
-          <w:lang w:val="es-ES"/>
-        </w:rPr>
-        <w:t xml:space="preserve"> es un paquete de R que básicamente </w:t>
-      </w:r>
-      <w:r>
-        <w:rPr>
-          <w:lang w:val="es-ES"/>
-        </w:rPr>
-        <w:t xml:space="preserve">genera residuos </w:t>
-      </w:r>
-      <w:proofErr w:type="spellStart"/>
-      <w:r>
-        <w:rPr>
-          <w:lang w:val="es-ES"/>
-        </w:rPr>
-        <w:t>cuantílicos</w:t>
-      </w:r>
-      <w:proofErr w:type="spellEnd"/>
-      <w:r>
-        <w:rPr>
-          <w:lang w:val="es-ES"/>
-        </w:rPr>
-        <w:t xml:space="preserve"> escalados por simulación</w:t>
+      <w:r>
+        <w:rPr>
+          <w:lang w:val="es-ES"/>
+        </w:rPr>
+        <w:t>(se escalan a la distribución U[0,1]) para evaluar el ajuste de modelos de regresión avanzados como LMs y GLMs, LMMs y GLMMs, modelos GAM, además de hacer otras simulaciones externas</w:t>
+      </w:r>
+      <w:r>
+        <w:rPr>
+          <w:lang w:val="es-ES"/>
+        </w:rPr>
+        <w:t>. Es útil porque nos da</w:t>
       </w:r>
       <w:r>
         <w:rPr>
@@ -7516,115 +6337,13 @@
         <w:rPr>
           <w:lang w:val="es-ES"/>
         </w:rPr>
-        <w:t xml:space="preserve">(se escalan a la distribución </w:t>
-      </w:r>
-      <w:proofErr w:type="gramStart"/>
-      <w:r>
-        <w:rPr>
-          <w:lang w:val="es-ES"/>
-        </w:rPr>
-        <w:t>U[</w:t>
-      </w:r>
-      <w:proofErr w:type="gramEnd"/>
-      <w:r>
-        <w:rPr>
-          <w:lang w:val="es-ES"/>
-        </w:rPr>
-        <w:t xml:space="preserve">0,1]) para evaluar el ajuste de modelos de regresión avanzados como </w:t>
-      </w:r>
-      <w:proofErr w:type="spellStart"/>
-      <w:r>
-        <w:rPr>
-          <w:lang w:val="es-ES"/>
-        </w:rPr>
-        <w:t>LMs</w:t>
-      </w:r>
-      <w:proofErr w:type="spellEnd"/>
-      <w:r>
-        <w:rPr>
-          <w:lang w:val="es-ES"/>
-        </w:rPr>
-        <w:t xml:space="preserve"> y </w:t>
-      </w:r>
-      <w:proofErr w:type="spellStart"/>
-      <w:r>
-        <w:rPr>
-          <w:lang w:val="es-ES"/>
-        </w:rPr>
-        <w:t>GLMs</w:t>
-      </w:r>
-      <w:proofErr w:type="spellEnd"/>
-      <w:r>
-        <w:rPr>
-          <w:lang w:val="es-ES"/>
-        </w:rPr>
-        <w:t xml:space="preserve">, </w:t>
-      </w:r>
-      <w:proofErr w:type="spellStart"/>
-      <w:r>
-        <w:rPr>
-          <w:lang w:val="es-ES"/>
-        </w:rPr>
-        <w:t>LMMs</w:t>
-      </w:r>
-      <w:proofErr w:type="spellEnd"/>
-      <w:r>
-        <w:rPr>
-          <w:lang w:val="es-ES"/>
-        </w:rPr>
-        <w:t xml:space="preserve"> y </w:t>
-      </w:r>
-      <w:proofErr w:type="spellStart"/>
-      <w:r>
-        <w:rPr>
-          <w:lang w:val="es-ES"/>
-        </w:rPr>
-        <w:t>GLMMs</w:t>
-      </w:r>
-      <w:proofErr w:type="spellEnd"/>
-      <w:r>
-        <w:rPr>
-          <w:lang w:val="es-ES"/>
-        </w:rPr>
-        <w:t>, modelos GAM, además de hacer otras simulaciones externas</w:t>
-      </w:r>
-      <w:r>
-        <w:rPr>
-          <w:lang w:val="es-ES"/>
-        </w:rPr>
-        <w:t>. Es útil porque nos da</w:t>
-      </w:r>
-      <w:r>
-        <w:rPr>
-          <w:lang w:val="es-ES"/>
-        </w:rPr>
-        <w:t xml:space="preserve"> </w:t>
-      </w:r>
-      <w:r>
-        <w:rPr>
-          <w:lang w:val="es-ES"/>
-        </w:rPr>
         <w:t xml:space="preserve">varios </w:t>
       </w:r>
       <w:r>
         <w:rPr>
           <w:lang w:val="es-ES"/>
         </w:rPr>
-        <w:t xml:space="preserve">gráficos y </w:t>
-      </w:r>
-      <w:proofErr w:type="spellStart"/>
-      <w:r>
-        <w:rPr>
-          <w:lang w:val="es-ES"/>
-        </w:rPr>
-        <w:t>tests</w:t>
-      </w:r>
-      <w:proofErr w:type="spellEnd"/>
-      <w:r>
-        <w:rPr>
-          <w:lang w:val="es-ES"/>
-        </w:rPr>
-        <w:t xml:space="preserve"> diagnósticos</w:t>
+        <w:t>gráficos y tests diagnósticos</w:t>
       </w:r>
       <w:r>
         <w:rPr>
@@ -7640,47 +6359,13 @@
           <w:numId w:val="8"/>
         </w:numPr>
       </w:pPr>
-      <w:proofErr w:type="spellStart"/>
       <w:r>
         <w:rPr>
           <w:b/>
           <w:bCs/>
         </w:rPr>
-        <w:t>Selección</w:t>
-      </w:r>
-      <w:proofErr w:type="spellEnd"/>
-      <w:r>
-        <w:rPr>
-          <w:b/>
-          <w:bCs/>
-        </w:rPr>
-        <w:t xml:space="preserve"> del </w:t>
-      </w:r>
-      <w:proofErr w:type="spellStart"/>
-      <w:r>
-        <w:rPr>
-          <w:b/>
-          <w:bCs/>
-        </w:rPr>
-        <w:t>mejor</w:t>
-      </w:r>
-      <w:proofErr w:type="spellEnd"/>
-      <w:r>
-        <w:rPr>
-          <w:b/>
-          <w:bCs/>
-        </w:rPr>
-        <w:t xml:space="preserve"> </w:t>
-      </w:r>
-      <w:proofErr w:type="spellStart"/>
-      <w:r>
-        <w:rPr>
-          <w:b/>
-          <w:bCs/>
-        </w:rPr>
-        <w:t>modelo</w:t>
-      </w:r>
-      <w:proofErr w:type="spellEnd"/>
+        <w:t>Selección del mejor modelo</w:t>
+      </w:r>
       <w:r>
         <w:rPr>
           <w:b/>
@@ -7756,35 +6441,7 @@
         <w:rPr>
           <w:lang w:val="es-ES"/>
         </w:rPr>
-        <w:t xml:space="preserve">Usamos </w:t>
-      </w:r>
-      <w:proofErr w:type="spellStart"/>
-      <w:r>
-        <w:rPr>
-          <w:lang w:val="es-ES"/>
-        </w:rPr>
-        <w:t>glht</w:t>
-      </w:r>
-      <w:proofErr w:type="spellEnd"/>
-      <w:r>
-        <w:rPr>
-          <w:lang w:val="es-ES"/>
-        </w:rPr>
-        <w:t xml:space="preserve"> y </w:t>
-      </w:r>
-      <w:proofErr w:type="spellStart"/>
-      <w:r>
-        <w:rPr>
-          <w:lang w:val="es-ES"/>
-        </w:rPr>
-        <w:t>emmeans</w:t>
-      </w:r>
-      <w:proofErr w:type="spellEnd"/>
-      <w:r>
-        <w:rPr>
-          <w:lang w:val="es-ES"/>
-        </w:rPr>
-        <w:t xml:space="preserve"> para contrastes de Tukey y obtenemos letras de significación.</w:t>
+        <w:t>Usamos glht y emmeans para contrastes de Tukey y obtenemos letras de significación.</w:t>
       </w:r>
     </w:p>
     <w:p>
@@ -7794,7 +6451,6 @@
           <w:numId w:val="8"/>
         </w:numPr>
       </w:pPr>
-      <w:proofErr w:type="spellStart"/>
       <w:r>
         <w:rPr>
           <w:b/>
@@ -7802,7 +6458,6 @@
         </w:rPr>
         <w:t>Visualización</w:t>
       </w:r>
-      <w:proofErr w:type="spellEnd"/>
       <w:r>
         <w:rPr>
           <w:b/>
@@ -7825,21 +6480,7 @@
         <w:rPr>
           <w:lang w:val="es-ES"/>
         </w:rPr>
-        <w:t xml:space="preserve">Generamos </w:t>
-      </w:r>
-      <w:proofErr w:type="spellStart"/>
-      <w:r>
-        <w:rPr>
-          <w:lang w:val="es-ES"/>
-        </w:rPr>
-        <w:t>boxplots</w:t>
-      </w:r>
-      <w:proofErr w:type="spellEnd"/>
-      <w:r>
-        <w:rPr>
-          <w:lang w:val="es-ES"/>
-        </w:rPr>
-        <w:t xml:space="preserve"> con las letras de comparación entre tratamientos.</w:t>
+        <w:t>Generamos boxplots con las letras de comparación entre tratamientos.</w:t>
       </w:r>
     </w:p>
     <w:p>
@@ -7879,25 +6520,7 @@
           <w:bCs/>
           <w:lang w:val="es-ES"/>
         </w:rPr>
-        <w:t xml:space="preserve">En cuanto a las conclusiones del modelo </w:t>
-      </w:r>
-      <w:proofErr w:type="spellStart"/>
-      <w:r>
-        <w:rPr>
-          <w:b/>
-          <w:bCs/>
-          <w:lang w:val="es-ES"/>
-        </w:rPr>
-        <w:t>utillizado</w:t>
-      </w:r>
-      <w:proofErr w:type="spellEnd"/>
-      <w:r>
-        <w:rPr>
-          <w:b/>
-          <w:bCs/>
-          <w:lang w:val="es-ES"/>
-        </w:rPr>
-        <w:t xml:space="preserve"> (el mejor de todos los probados)</w:t>
+        <w:t>En cuanto a las conclusiones del modelo utillizado (el mejor de todos los probados)</w:t>
       </w:r>
     </w:p>
     <w:p>
@@ -7912,17 +6535,8 @@
           <w:b/>
           <w:bCs/>
         </w:rPr>
-        <w:t xml:space="preserve">ANOVA </w:t>
-      </w:r>
-      <w:proofErr w:type="spellStart"/>
-      <w:r>
-        <w:rPr>
-          <w:b/>
-          <w:bCs/>
-        </w:rPr>
-        <w:t>clásico</w:t>
-      </w:r>
-      <w:proofErr w:type="spellEnd"/>
+        <w:t>ANOVA clásico</w:t>
+      </w:r>
     </w:p>
     <w:p>
       <w:pPr>
@@ -7982,21 +6596,12 @@
           <w:numId w:val="10"/>
         </w:numPr>
       </w:pPr>
-      <w:proofErr w:type="spellStart"/>
       <w:r>
         <w:rPr>
           <w:b/>
           <w:bCs/>
         </w:rPr>
-        <w:t>Modelos</w:t>
-      </w:r>
-      <w:proofErr w:type="spellEnd"/>
-      <w:r>
-        <w:rPr>
-          <w:b/>
-          <w:bCs/>
-        </w:rPr>
-        <w:t xml:space="preserve"> GLM</w:t>
+        <w:t>Modelos GLM</w:t>
       </w:r>
     </w:p>
     <w:p>
@@ -8056,23 +6661,7 @@
         <w:t>Poisson:</w:t>
       </w:r>
       <w:r>
-        <w:t xml:space="preserve"> </w:t>
-      </w:r>
-      <w:proofErr w:type="spellStart"/>
-      <w:r>
-        <w:t>problemas</w:t>
-      </w:r>
-      <w:proofErr w:type="spellEnd"/>
-      <w:r>
-        <w:t xml:space="preserve"> de </w:t>
-      </w:r>
-      <w:proofErr w:type="spellStart"/>
-      <w:r>
-        <w:t>sobredispersión</w:t>
-      </w:r>
-      <w:proofErr w:type="spellEnd"/>
-      <w:r>
-        <w:t>.</w:t>
+        <w:t xml:space="preserve"> problemas de sobredispersión.</w:t>
       </w:r>
     </w:p>
     <w:p>
@@ -8178,25 +6767,7 @@
           <w:bCs/>
           <w:lang w:val="es-ES"/>
         </w:rPr>
-        <w:t xml:space="preserve">En cuanto a las conclusiones sobre el conteo de insectos (del </w:t>
-      </w:r>
-      <w:proofErr w:type="spellStart"/>
-      <w:r>
-        <w:rPr>
-          <w:b/>
-          <w:bCs/>
-          <w:lang w:val="es-ES"/>
-        </w:rPr>
-        <w:t>boxplot</w:t>
-      </w:r>
-      <w:proofErr w:type="spellEnd"/>
-      <w:r>
-        <w:rPr>
-          <w:b/>
-          <w:bCs/>
-          <w:lang w:val="es-ES"/>
-        </w:rPr>
-        <w:t>)</w:t>
+        <w:t>En cuanto a las conclusiones sobre el conteo de insectos (del boxplot)</w:t>
       </w:r>
     </w:p>
     <w:p>
@@ -8245,21 +6816,7 @@
         <w:rPr>
           <w:lang w:val="es-ES"/>
         </w:rPr>
-        <w:t xml:space="preserve">Los </w:t>
-      </w:r>
-      <w:proofErr w:type="spellStart"/>
-      <w:r>
-        <w:rPr>
-          <w:lang w:val="es-ES"/>
-        </w:rPr>
-        <w:t>tests</w:t>
-      </w:r>
-      <w:proofErr w:type="spellEnd"/>
-      <w:r>
-        <w:rPr>
-          <w:lang w:val="es-ES"/>
-        </w:rPr>
-        <w:t xml:space="preserve"> de comparación múltiple le asignan la letra </w:t>
+        <w:t xml:space="preserve">Los tests de comparación múltiple le asignan la letra </w:t>
       </w:r>
       <w:r>
         <w:rPr>
@@ -8273,21 +6830,7 @@
         <w:rPr>
           <w:lang w:val="es-ES"/>
         </w:rPr>
-        <w:t xml:space="preserve"> (en el </w:t>
-      </w:r>
-      <w:proofErr w:type="spellStart"/>
-      <w:r>
-        <w:rPr>
-          <w:lang w:val="es-ES"/>
-        </w:rPr>
-        <w:t>boxplot</w:t>
-      </w:r>
-      <w:proofErr w:type="spellEnd"/>
-      <w:r>
-        <w:rPr>
-          <w:lang w:val="es-ES"/>
-        </w:rPr>
-        <w:t xml:space="preserve">), lo que indica que </w:t>
+        <w:t xml:space="preserve"> (en el boxplot), lo que indica que </w:t>
       </w:r>
       <w:r>
         <w:rPr>
@@ -8311,21 +6854,12 @@
           <w:numId w:val="12"/>
         </w:numPr>
       </w:pPr>
-      <w:proofErr w:type="spellStart"/>
       <w:r>
         <w:rPr>
           <w:b/>
           <w:bCs/>
         </w:rPr>
-        <w:t>Tratamiento</w:t>
-      </w:r>
-      <w:proofErr w:type="spellEnd"/>
-      <w:r>
-        <w:rPr>
-          <w:b/>
-          <w:bCs/>
-        </w:rPr>
-        <w:t xml:space="preserve"> A</w:t>
+        <w:t>Tratamiento A</w:t>
       </w:r>
     </w:p>
     <w:p>
@@ -8359,21 +6893,7 @@
         <w:rPr>
           <w:lang w:val="es-ES"/>
         </w:rPr>
-        <w:t xml:space="preserve">En el </w:t>
-      </w:r>
-      <w:proofErr w:type="spellStart"/>
-      <w:r>
-        <w:rPr>
-          <w:lang w:val="es-ES"/>
-        </w:rPr>
-        <w:t>boxplot</w:t>
-      </w:r>
-      <w:proofErr w:type="spellEnd"/>
-      <w:r>
-        <w:rPr>
-          <w:lang w:val="es-ES"/>
-        </w:rPr>
-        <w:t xml:space="preserve"> figura como </w:t>
+        <w:t xml:space="preserve">En el boxplot figura como </w:t>
       </w:r>
       <w:r>
         <w:rPr>
@@ -8411,21 +6931,12 @@
           <w:numId w:val="13"/>
         </w:numPr>
       </w:pPr>
-      <w:proofErr w:type="spellStart"/>
       <w:r>
         <w:rPr>
           <w:b/>
           <w:bCs/>
         </w:rPr>
-        <w:t>Tratamiento</w:t>
-      </w:r>
-      <w:proofErr w:type="spellEnd"/>
-      <w:r>
-        <w:rPr>
-          <w:b/>
-          <w:bCs/>
-        </w:rPr>
-        <w:t xml:space="preserve"> B</w:t>
+        <w:t>Tratamiento B</w:t>
       </w:r>
     </w:p>
     <w:p>
@@ -8498,37 +7009,12 @@
           <w:numId w:val="14"/>
         </w:numPr>
       </w:pPr>
-      <w:proofErr w:type="spellStart"/>
       <w:r>
         <w:rPr>
           <w:b/>
           <w:bCs/>
         </w:rPr>
-        <w:t>Tratamiento</w:t>
-      </w:r>
-      <w:proofErr w:type="spellEnd"/>
-      <w:r>
-        <w:rPr>
-          <w:b/>
-          <w:bCs/>
-        </w:rPr>
-        <w:t xml:space="preserve"> A+B (</w:t>
-      </w:r>
-      <w:proofErr w:type="spellStart"/>
-      <w:r>
-        <w:rPr>
-          <w:b/>
-          <w:bCs/>
-        </w:rPr>
-        <w:t>combinado</w:t>
-      </w:r>
-      <w:proofErr w:type="spellEnd"/>
-      <w:r>
-        <w:rPr>
-          <w:b/>
-          <w:bCs/>
-        </w:rPr>
-        <w:t>)</w:t>
+        <w:t>Tratamiento A+B (combinado)</w:t>
       </w:r>
     </w:p>
     <w:p>
@@ -8600,21 +7086,12 @@
           <w:numId w:val="15"/>
         </w:numPr>
       </w:pPr>
-      <w:proofErr w:type="spellStart"/>
       <w:r>
         <w:rPr>
           <w:b/>
           <w:bCs/>
         </w:rPr>
-        <w:t>Resumen</w:t>
-      </w:r>
-      <w:proofErr w:type="spellEnd"/>
-      <w:r>
-        <w:rPr>
-          <w:b/>
-          <w:bCs/>
-        </w:rPr>
-        <w:t>:</w:t>
+        <w:t>Resumen:</w:t>
       </w:r>
     </w:p>
     <w:p>
@@ -8741,6 +7218,7 @@
       </w:pPr>
       <w:r>
         <w:rPr>
+          <w:noProof/>
           <w:lang w:val="es-ES"/>
         </w:rPr>
         <w:drawing>
@@ -8786,6 +7264,7 @@
       </w:pPr>
       <w:r>
         <w:rPr>
+          <w:noProof/>
           <w:lang w:val="es-ES"/>
         </w:rPr>
         <w:drawing>
@@ -8864,21 +7343,7 @@
         <w:rPr>
           <w:lang w:val="es-ES"/>
         </w:rPr>
-        <w:t xml:space="preserve">: Análisis </w:t>
-      </w:r>
-      <w:proofErr w:type="spellStart"/>
-      <w:r>
-        <w:rPr>
-          <w:lang w:val="es-ES"/>
-        </w:rPr>
-        <w:t>post-hoc</w:t>
-      </w:r>
-      <w:proofErr w:type="spellEnd"/>
-      <w:r>
-        <w:rPr>
-          <w:lang w:val="es-ES"/>
-        </w:rPr>
-        <w:t xml:space="preserve"> de diferencia de medias</w:t>
+        <w:t>: Análisis post-hoc de diferencia de medias</w:t>
       </w:r>
     </w:p>
     <w:p>
@@ -8894,6 +7359,7 @@
       </w:pPr>
       <w:r>
         <w:rPr>
+          <w:noProof/>
           <w:lang w:val="es-ES"/>
         </w:rPr>
         <w:lastRenderedPageBreak/>
@@ -8974,21 +7440,7 @@
         <w:rPr>
           <w:lang w:val="es-ES"/>
         </w:rPr>
-        <w:t xml:space="preserve">: </w:t>
-      </w:r>
-      <w:proofErr w:type="spellStart"/>
-      <w:r>
-        <w:rPr>
-          <w:lang w:val="es-ES"/>
-        </w:rPr>
-        <w:t>Boxplot</w:t>
-      </w:r>
-      <w:proofErr w:type="spellEnd"/>
-      <w:r>
-        <w:rPr>
-          <w:lang w:val="es-ES"/>
-        </w:rPr>
-        <w:t xml:space="preserve"> agrupado por letras de grupos diferenciados de forma estadísticamente significativa </w:t>
+        <w:t xml:space="preserve">: Boxplot agrupado por letras de grupos diferenciados de forma estadísticamente significativa </w:t>
       </w:r>
       <w:r>
         <w:rPr>
@@ -9188,37 +7640,15 @@
       <w:pPr>
         <w:pStyle w:val="Ttulo3"/>
         <w:rPr>
-          <w:lang w:val="en-US"/>
+          <w:lang w:val="es-ES"/>
         </w:rPr>
       </w:pPr>
       <w:bookmarkStart w:id="17" w:name="_Toc208536931"/>
-      <w:proofErr w:type="spellStart"/>
-      <w:r>
-        <w:rPr>
-          <w:lang w:val="en-US"/>
-        </w:rPr>
-        <w:t>Introducción</w:t>
-      </w:r>
-      <w:proofErr w:type="spellEnd"/>
-      <w:r>
-        <w:rPr>
-          <w:lang w:val="en-US"/>
-        </w:rPr>
-        <w:t xml:space="preserve"> de la </w:t>
-      </w:r>
-      <w:proofErr w:type="spellStart"/>
-      <w:r>
-        <w:rPr>
-          <w:lang w:val="en-US"/>
-        </w:rPr>
-        <w:t>actividad</w:t>
-      </w:r>
-      <w:proofErr w:type="spellEnd"/>
-      <w:r>
-        <w:rPr>
-          <w:lang w:val="en-US"/>
-        </w:rPr>
-        <w:t xml:space="preserve"> 3</w:t>
+      <w:r>
+        <w:rPr>
+          <w:lang w:val="es-ES"/>
+        </w:rPr>
+        <w:t>Introducción de la actividad 3</w:t>
       </w:r>
       <w:bookmarkEnd w:id="17"/>
     </w:p>
@@ -9226,7 +7656,7 @@
       <w:pPr>
         <w:rPr>
           <w:noProof/>
-          <w:lang w:val="en-US"/>
+          <w:lang w:val="es-ES"/>
         </w:rPr>
       </w:pPr>
       <w:r>
@@ -9285,7 +7715,7 @@
       <w:r>
         <w:rPr>
           <w:noProof/>
-          <w:lang w:val="en-US"/>
+          <w:lang w:val="es-ES"/>
         </w:rPr>
         <w:t xml:space="preserve"> </w:t>
       </w:r>
@@ -9348,7 +7778,7 @@
       <w:pPr>
         <w:rPr>
           <w:noProof/>
-          <w:lang w:val="en-US"/>
+          <w:lang w:val="es-ES"/>
         </w:rPr>
       </w:pPr>
     </w:p>
@@ -9356,7 +7786,7 @@
       <w:pPr>
         <w:rPr>
           <w:noProof/>
-          <w:lang w:val="en-US"/>
+          <w:lang w:val="es-ES"/>
         </w:rPr>
       </w:pPr>
     </w:p>
@@ -9364,7 +7794,7 @@
       <w:pPr>
         <w:rPr>
           <w:noProof/>
-          <w:lang w:val="en-US"/>
+          <w:lang w:val="es-ES"/>
         </w:rPr>
       </w:pPr>
     </w:p>
@@ -9372,7 +7802,7 @@
       <w:pPr>
         <w:rPr>
           <w:noProof/>
-          <w:lang w:val="en-US"/>
+          <w:lang w:val="es-ES"/>
         </w:rPr>
       </w:pPr>
     </w:p>
@@ -9380,7 +7810,7 @@
       <w:pPr>
         <w:rPr>
           <w:noProof/>
-          <w:lang w:val="en-US"/>
+          <w:lang w:val="es-ES"/>
         </w:rPr>
       </w:pPr>
     </w:p>
@@ -9388,7 +7818,7 @@
       <w:pPr>
         <w:rPr>
           <w:noProof/>
-          <w:lang w:val="en-US"/>
+          <w:lang w:val="es-ES"/>
         </w:rPr>
       </w:pPr>
     </w:p>
@@ -9396,7 +7826,7 @@
       <w:pPr>
         <w:rPr>
           <w:noProof/>
-          <w:lang w:val="en-US"/>
+          <w:lang w:val="es-ES"/>
         </w:rPr>
       </w:pPr>
     </w:p>
@@ -9404,14 +7834,14 @@
       <w:pPr>
         <w:rPr>
           <w:noProof/>
-          <w:lang w:val="en-US"/>
-        </w:rPr>
-      </w:pPr>
-    </w:p>
-    <w:p>
-      <w:pPr>
-        <w:rPr>
-          <w:lang w:val="en-US"/>
+          <w:lang w:val="es-ES"/>
+        </w:rPr>
+      </w:pPr>
+    </w:p>
+    <w:p>
+      <w:pPr>
+        <w:rPr>
+          <w:lang w:val="es-ES"/>
         </w:rPr>
       </w:pPr>
     </w:p>
@@ -9441,12 +7871,12 @@
       <w:pPr>
         <w:pStyle w:val="Ttulo4"/>
         <w:rPr>
-          <w:lang w:val="en-US"/>
-        </w:rPr>
-      </w:pPr>
-      <w:r>
-        <w:rPr>
-          <w:lang w:val="en-US"/>
+          <w:lang w:val="es-ES"/>
+        </w:rPr>
+      </w:pPr>
+      <w:r>
+        <w:rPr>
+          <w:lang w:val="es-ES"/>
         </w:rPr>
         <w:t>2017</w:t>
       </w:r>
@@ -9457,7 +7887,7 @@
           <w:rFonts w:ascii="Times New Roman" w:eastAsia="Times New Roman" w:hAnsi="Times New Roman" w:cs="Times New Roman"/>
           <w:sz w:val="24"/>
           <w:szCs w:val="24"/>
-          <w:lang w:eastAsia="en-GB"/>
+          <w:lang w:val="es-ES" w:eastAsia="en-GB"/>
         </w:rPr>
       </w:pPr>
       <w:r>
@@ -9519,11 +7949,14 @@
           <w:rFonts w:ascii="Times New Roman" w:eastAsia="Times New Roman" w:hAnsi="Times New Roman" w:cs="Times New Roman"/>
           <w:sz w:val="24"/>
           <w:szCs w:val="24"/>
-          <w:lang w:eastAsia="en-GB"/>
+          <w:lang w:val="es-ES" w:eastAsia="en-GB"/>
         </w:rPr>
         <w:t xml:space="preserve"> </w:t>
       </w:r>
       <w:r>
+        <w:rPr>
+          <w:noProof/>
+        </w:rPr>
         <w:drawing>
           <wp:inline distT="0" distB="0" distL="0" distR="0" wp14:anchorId="71570459" wp14:editId="324EC777">
             <wp:extent cx="5400040" cy="3037840"/>
@@ -9580,7 +8013,7 @@
           <w:rFonts w:ascii="Times New Roman" w:eastAsia="Times New Roman" w:hAnsi="Times New Roman" w:cs="Times New Roman"/>
           <w:sz w:val="24"/>
           <w:szCs w:val="24"/>
-          <w:lang w:eastAsia="en-GB"/>
+          <w:lang w:val="es-ES" w:eastAsia="en-GB"/>
         </w:rPr>
       </w:pPr>
     </w:p>
@@ -9590,7 +8023,7 @@
           <w:rFonts w:ascii="Times New Roman" w:eastAsia="Times New Roman" w:hAnsi="Times New Roman" w:cs="Times New Roman"/>
           <w:sz w:val="24"/>
           <w:szCs w:val="24"/>
-          <w:lang w:eastAsia="en-GB"/>
+          <w:lang w:val="es-ES" w:eastAsia="en-GB"/>
         </w:rPr>
       </w:pPr>
     </w:p>
@@ -9600,7 +8033,7 @@
           <w:rFonts w:ascii="Times New Roman" w:eastAsia="Times New Roman" w:hAnsi="Times New Roman" w:cs="Times New Roman"/>
           <w:sz w:val="24"/>
           <w:szCs w:val="24"/>
-          <w:lang w:eastAsia="en-GB"/>
+          <w:lang w:val="es-ES" w:eastAsia="en-GB"/>
         </w:rPr>
       </w:pPr>
     </w:p>
@@ -9610,7 +8043,7 @@
           <w:rFonts w:ascii="Times New Roman" w:eastAsia="Times New Roman" w:hAnsi="Times New Roman" w:cs="Times New Roman"/>
           <w:sz w:val="24"/>
           <w:szCs w:val="24"/>
-          <w:lang w:eastAsia="en-GB"/>
+          <w:lang w:val="es-ES" w:eastAsia="en-GB"/>
         </w:rPr>
       </w:pPr>
     </w:p>
@@ -9620,7 +8053,7 @@
           <w:rFonts w:ascii="Times New Roman" w:eastAsia="Times New Roman" w:hAnsi="Times New Roman" w:cs="Times New Roman"/>
           <w:sz w:val="24"/>
           <w:szCs w:val="24"/>
-          <w:lang w:eastAsia="en-GB"/>
+          <w:lang w:val="es-ES" w:eastAsia="en-GB"/>
         </w:rPr>
       </w:pPr>
     </w:p>
@@ -9630,7 +8063,7 @@
           <w:rFonts w:ascii="Times New Roman" w:eastAsia="Times New Roman" w:hAnsi="Times New Roman" w:cs="Times New Roman"/>
           <w:sz w:val="24"/>
           <w:szCs w:val="24"/>
-          <w:lang w:eastAsia="en-GB"/>
+          <w:lang w:val="es-ES" w:eastAsia="en-GB"/>
         </w:rPr>
       </w:pPr>
     </w:p>
@@ -9640,7 +8073,7 @@
           <w:rFonts w:ascii="Times New Roman" w:eastAsia="Times New Roman" w:hAnsi="Times New Roman" w:cs="Times New Roman"/>
           <w:sz w:val="24"/>
           <w:szCs w:val="24"/>
-          <w:lang w:eastAsia="en-GB"/>
+          <w:lang w:val="es-ES" w:eastAsia="en-GB"/>
         </w:rPr>
       </w:pPr>
     </w:p>
@@ -9650,7 +8083,7 @@
           <w:rFonts w:ascii="Times New Roman" w:eastAsia="Times New Roman" w:hAnsi="Times New Roman" w:cs="Times New Roman"/>
           <w:sz w:val="24"/>
           <w:szCs w:val="24"/>
-          <w:lang w:eastAsia="en-GB"/>
+          <w:lang w:val="es-ES" w:eastAsia="en-GB"/>
         </w:rPr>
       </w:pPr>
     </w:p>
@@ -9660,7 +8093,7 @@
           <w:rFonts w:ascii="Times New Roman" w:eastAsia="Times New Roman" w:hAnsi="Times New Roman" w:cs="Times New Roman"/>
           <w:sz w:val="24"/>
           <w:szCs w:val="24"/>
-          <w:lang w:eastAsia="en-GB"/>
+          <w:lang w:val="es-ES" w:eastAsia="en-GB"/>
         </w:rPr>
       </w:pPr>
     </w:p>
@@ -9669,13 +8102,13 @@
         <w:pStyle w:val="Ttulo4"/>
         <w:rPr>
           <w:rFonts w:eastAsia="Times New Roman"/>
-          <w:lang w:eastAsia="en-GB"/>
+          <w:lang w:val="es-ES" w:eastAsia="en-GB"/>
         </w:rPr>
       </w:pPr>
       <w:r>
         <w:rPr>
           <w:rFonts w:eastAsia="Times New Roman"/>
-          <w:lang w:eastAsia="en-GB"/>
+          <w:lang w:val="es-ES" w:eastAsia="en-GB"/>
         </w:rPr>
         <w:t>2018</w:t>
       </w:r>
@@ -9753,6 +8186,9 @@
         <w:t xml:space="preserve"> </w:t>
       </w:r>
       <w:r>
+        <w:rPr>
+          <w:noProof/>
+        </w:rPr>
         <w:drawing>
           <wp:inline distT="0" distB="0" distL="0" distR="0" wp14:anchorId="103133BF" wp14:editId="4A9AE9D2">
             <wp:extent cx="5400040" cy="3037840"/>
@@ -9937,6 +8373,7 @@
       <w:r>
         <w:rPr>
           <w:rFonts w:eastAsia="Times New Roman"/>
+          <w:noProof/>
           <w:lang w:eastAsia="en-GB"/>
         </w:rPr>
         <w:drawing>
@@ -9991,6 +8428,9 @@
     </w:p>
     <w:p>
       <w:r>
+        <w:rPr>
+          <w:noProof/>
+        </w:rPr>
         <w:drawing>
           <wp:inline distT="0" distB="0" distL="0" distR="0" wp14:anchorId="710DE01A" wp14:editId="3C5B48B8">
             <wp:extent cx="5400040" cy="3037840"/>
@@ -10058,46 +8498,19 @@
         </w:rPr>
       </w:pPr>
       <w:bookmarkStart w:id="20" w:name="_Toc208536934"/>
-      <w:proofErr w:type="spellStart"/>
       <w:r>
         <w:rPr>
           <w:lang w:val="en-US"/>
         </w:rPr>
-        <w:t>Persistencia</w:t>
-      </w:r>
-      <w:proofErr w:type="spellEnd"/>
-      <w:r>
-        <w:rPr>
-          <w:lang w:val="en-US"/>
-        </w:rPr>
-        <w:t xml:space="preserve"> de </w:t>
-      </w:r>
-      <w:proofErr w:type="spellStart"/>
-      <w:r>
-        <w:rPr>
-          <w:lang w:val="en-US"/>
-        </w:rPr>
-        <w:t>los</w:t>
-      </w:r>
-      <w:proofErr w:type="spellEnd"/>
-      <w:r>
-        <w:rPr>
-          <w:lang w:val="en-US"/>
-        </w:rPr>
-        <w:t xml:space="preserve"> </w:t>
-      </w:r>
-      <w:proofErr w:type="spellStart"/>
-      <w:r>
-        <w:rPr>
-          <w:lang w:val="en-US"/>
-        </w:rPr>
-        <w:t>tratamientos</w:t>
+        <w:t>Persistencia de los tratamientos</w:t>
       </w:r>
       <w:bookmarkEnd w:id="20"/>
-      <w:proofErr w:type="spellEnd"/>
-    </w:p>
-    <w:p>
-      <w:r>
+    </w:p>
+    <w:p>
+      <w:r>
+        <w:rPr>
+          <w:noProof/>
+        </w:rPr>
         <w:drawing>
           <wp:inline distT="0" distB="0" distL="0" distR="0" wp14:anchorId="15019DAD" wp14:editId="7A0ABFB9">
             <wp:extent cx="5400040" cy="3037840"/>
@@ -10150,6 +8563,9 @@
     </w:p>
     <w:p>
       <w:r>
+        <w:rPr>
+          <w:noProof/>
+        </w:rPr>
         <w:drawing>
           <wp:inline distT="0" distB="0" distL="0" distR="0" wp14:anchorId="096A2029" wp14:editId="4760736D">
             <wp:extent cx="5400040" cy="3037840"/>
@@ -10202,6 +8618,9 @@
     </w:p>
     <w:p>
       <w:r>
+        <w:rPr>
+          <w:noProof/>
+        </w:rPr>
         <w:lastRenderedPageBreak/>
         <w:drawing>
           <wp:inline distT="0" distB="0" distL="0" distR="0" wp14:anchorId="5A38EEB8" wp14:editId="552AE5AE">
@@ -10255,6 +8674,9 @@
     </w:p>
     <w:p>
       <w:r>
+        <w:rPr>
+          <w:noProof/>
+        </w:rPr>
         <w:drawing>
           <wp:inline distT="0" distB="0" distL="0" distR="0" wp14:anchorId="69BA2012" wp14:editId="246D46E8">
             <wp:extent cx="5400040" cy="3037840"/>
@@ -10333,6 +8755,9 @@
     </w:p>
     <w:p>
       <w:r>
+        <w:rPr>
+          <w:noProof/>
+        </w:rPr>
         <w:drawing>
           <wp:inline distT="0" distB="0" distL="0" distR="0" wp14:anchorId="0F45E922" wp14:editId="080D6F55">
             <wp:extent cx="5400040" cy="3037840"/>
@@ -10385,6 +8810,9 @@
     </w:p>
     <w:p>
       <w:r>
+        <w:rPr>
+          <w:noProof/>
+        </w:rPr>
         <w:drawing>
           <wp:inline distT="0" distB="0" distL="0" distR="0" wp14:anchorId="0674C947" wp14:editId="495A6183">
             <wp:extent cx="5400040" cy="3037840"/>
@@ -10524,33 +8952,11 @@
         </w:rPr>
       </w:pPr>
       <w:bookmarkStart w:id="22" w:name="_Toc208536936"/>
-      <w:proofErr w:type="spellStart"/>
       <w:r>
         <w:rPr>
           <w:lang w:val="en-US"/>
         </w:rPr>
-        <w:t>Apéndice</w:t>
-      </w:r>
-      <w:proofErr w:type="spellEnd"/>
-      <w:r>
-        <w:rPr>
-          <w:lang w:val="en-US"/>
-        </w:rPr>
-        <w:t xml:space="preserve"> de la </w:t>
-      </w:r>
-      <w:proofErr w:type="spellStart"/>
-      <w:r>
-        <w:rPr>
-          <w:lang w:val="en-US"/>
-        </w:rPr>
-        <w:t>actividad</w:t>
-      </w:r>
-      <w:proofErr w:type="spellEnd"/>
-      <w:r>
-        <w:rPr>
-          <w:lang w:val="en-US"/>
-        </w:rPr>
-        <w:t xml:space="preserve"> 3</w:t>
+        <w:t>Apéndice de la actividad 3</w:t>
       </w:r>
       <w:bookmarkEnd w:id="22"/>
     </w:p>
@@ -10566,6 +8972,7 @@
         <w:rPr>
           <w:b/>
           <w:bCs/>
+          <w:noProof/>
         </w:rPr>
         <w:drawing>
           <wp:inline distT="0" distB="0" distL="0" distR="0" wp14:anchorId="2B5BCBB0" wp14:editId="7BA1E465">
@@ -10629,6 +9036,7 @@
         <w:rPr>
           <w:b/>
           <w:bCs/>
+          <w:noProof/>
         </w:rPr>
         <w:drawing>
           <wp:inline distT="0" distB="0" distL="0" distR="0" wp14:anchorId="0CC3DF25" wp14:editId="51544A02">
@@ -10723,21 +9131,7 @@
             <w:rStyle w:val="Hipervnculo"/>
             <w:lang w:val="es-ES"/>
           </w:rPr>
-          <w:t xml:space="preserve">Link a mi proyecto de prácticas de empresa </w:t>
-        </w:r>
-        <w:r>
-          <w:rPr>
-            <w:rStyle w:val="Hipervnculo"/>
-            <w:lang w:val="es-ES"/>
-          </w:rPr>
-          <w:t>p</w:t>
-        </w:r>
-        <w:r>
-          <w:rPr>
-            <w:rStyle w:val="Hipervnculo"/>
-            <w:lang w:val="es-ES"/>
-          </w:rPr>
-          <w:t>ara el laboratorio de fitopatología</w:t>
+          <w:t>Link a mi proyecto de prácticas de empresa para el laboratorio de fitopatología</w:t>
         </w:r>
         <w:r>
           <w:rPr>
@@ -10838,14 +9232,7 @@
         <w:rPr>
           <w:lang w:val="es-ES"/>
         </w:rPr>
-        <w:t xml:space="preserve">procedentes de bioensayos con fines de estudiar el comportamiento de distintas plantas y árboles y las diferencias entre aplicar tratamientos con respecto a un control bajo condiciones controladas del entorno (ya sea en parcelas, probetas, etc.) y con organismos de prueba controlados. Estoy muy sorprendido del alcance que podían los análisis dentro de la biología y cómo lo que habíamos visto en asignaturas de análisis de datos I ha servido de base para hacer la interpretación que he hecho, incluso con aplicaciones a nivel internacional en un trabajo de </w:t>
-      </w:r>
-      <w:proofErr w:type="spellStart"/>
-      <w:r>
-        <w:rPr>
-          <w:lang w:val="es-ES"/>
-        </w:rPr>
-        <w:t>semi</w:t>
+        <w:t>procedentes de bioensayos con fines de estudiar el comportamiento de distintas plantas y árboles y las diferencias entre aplicar tratamientos con respecto a un control bajo condiciones controladas del entorno (ya sea en parcelas, probetas, etc.) y con organismos de prueba controlados. Estoy muy sorprendido del alcance que podían los análisis dentro de la biología y cómo lo que habíamos visto en asignaturas de análisis de datos I ha servido de base para hacer la interpretación que he hecho, incluso con aplicaciones a nivel internacional en un trabajo de semi</w:t>
       </w:r>
       <w:r>
         <w:rPr>
@@ -10857,48 +9244,27 @@
         <w:rPr>
           <w:lang w:val="es-ES"/>
         </w:rPr>
-        <w:t>campo</w:t>
-      </w:r>
-      <w:proofErr w:type="spellEnd"/>
-      <w:r>
-        <w:rPr>
-          <w:lang w:val="es-ES"/>
-        </w:rPr>
-        <w:t xml:space="preserve"> de una universidad no española.</w:t>
-      </w:r>
-    </w:p>
-    <w:p>
-      <w:pPr>
-        <w:rPr>
-          <w:lang w:val="es-ES"/>
-        </w:rPr>
-      </w:pPr>
-    </w:p>
-    <w:p>
-      <w:pPr>
-        <w:rPr>
-          <w:lang w:val="es-ES"/>
-        </w:rPr>
-      </w:pPr>
-      <w:r>
-        <w:rPr>
-          <w:lang w:val="es-ES"/>
-        </w:rPr>
-        <w:t xml:space="preserve">Además, estas prácticas no solo me han servido para repasar conceptos de estadística que tenía olvidados y entender mejor los ANOVA y </w:t>
-      </w:r>
-      <w:proofErr w:type="spellStart"/>
-      <w:r>
-        <w:rPr>
-          <w:lang w:val="es-ES"/>
-        </w:rPr>
-        <w:t>GLMs</w:t>
-      </w:r>
-      <w:proofErr w:type="spellEnd"/>
-      <w:r>
-        <w:rPr>
-          <w:lang w:val="es-ES"/>
-        </w:rPr>
-        <w:t xml:space="preserve"> (aplicados a variables categóricas) que habíamos visto en asignaturas de análisis de datos I y II (sobre todo el de un factor y unidimensional), así como otros conceptos similares</w:t>
+        <w:t>campo de una universidad no española.</w:t>
+      </w:r>
+    </w:p>
+    <w:p>
+      <w:pPr>
+        <w:rPr>
+          <w:lang w:val="es-ES"/>
+        </w:rPr>
+      </w:pPr>
+    </w:p>
+    <w:p>
+      <w:pPr>
+        <w:rPr>
+          <w:lang w:val="es-ES"/>
+        </w:rPr>
+      </w:pPr>
+      <w:r>
+        <w:rPr>
+          <w:lang w:val="es-ES"/>
+        </w:rPr>
+        <w:t>Además, estas prácticas no solo me han servido para repasar conceptos de estadística que tenía olvidados y entender mejor los ANOVA y GLMs (aplicados a variables categóricas) que habíamos visto en asignaturas de análisis de datos I y II (sobre todo el de un factor y unidimensional), así como otros conceptos similares</w:t>
       </w:r>
       <w:r>
         <w:rPr>
@@ -10910,35 +9276,7 @@
         <w:rPr>
           <w:lang w:val="es-ES"/>
         </w:rPr>
-        <w:t xml:space="preserve"> nuevos conceptos que no había visto ni a lo largo del grado ni en particular en el último año en las dos asignaturas de análisis de datos que se ofrecen, en gran parte gracias a las explicaciones de mi profesor encargado, con el que además me comunicaba habitualmente, incluso con contacto directo por WhatsApp. Descubrí asimismo nuevas herramientas como </w:t>
-      </w:r>
-      <w:proofErr w:type="spellStart"/>
-      <w:r>
-        <w:rPr>
-          <w:lang w:val="es-ES"/>
-        </w:rPr>
-        <w:t>Quarto</w:t>
-      </w:r>
-      <w:proofErr w:type="spellEnd"/>
-      <w:r>
-        <w:rPr>
-          <w:lang w:val="es-ES"/>
-        </w:rPr>
-        <w:t xml:space="preserve"> para realizar informes, la cual me ha acabado gustando incluso más que otras como </w:t>
-      </w:r>
-      <w:proofErr w:type="spellStart"/>
-      <w:r>
-        <w:rPr>
-          <w:lang w:val="es-ES"/>
-        </w:rPr>
-        <w:t>Jupyter</w:t>
-      </w:r>
-      <w:proofErr w:type="spellEnd"/>
-      <w:r>
-        <w:rPr>
-          <w:lang w:val="es-ES"/>
-        </w:rPr>
-        <w:t xml:space="preserve"> Notebook (que sí he usado en el grado) y que muy posiblemente siga usando en el futuro (también tiene compatibilidad con Python). </w:t>
+        <w:t xml:space="preserve"> nuevos conceptos que no había visto ni a lo largo del grado ni en particular en el último año en las dos asignaturas de análisis de datos que se ofrecen, en gran parte gracias a las explicaciones de mi profesor encargado, con el que además me comunicaba habitualmente, incluso con contacto directo por WhatsApp. Descubrí asimismo nuevas herramientas como Quarto para realizar informes, la cual me ha acabado gustando incluso más que otras como Jupyter Notebook (que sí he usado en el grado) y que muy posiblemente siga usando en el futuro (también tiene compatibilidad con Python). </w:t>
       </w:r>
     </w:p>
     <w:p>
@@ -11047,21 +9385,7 @@
         <w:rPr>
           <w:lang w:val="es-ES"/>
         </w:rPr>
-        <w:t xml:space="preserve"> de hecho, tuve que usar algunos fines de semana para terminar parte de las prácticas, lo cual no me importaba demasiado porque eran solo unas pocas horas, pero sí que considero que al final en relación a los conocimientos que tenía al principio las prácticas eran difíciles. De hecho, las actividades 1 y 2 fueron más que necesarias porque tenía muchos conceptos de ANOVA y </w:t>
-      </w:r>
-      <w:proofErr w:type="spellStart"/>
-      <w:r>
-        <w:rPr>
-          <w:lang w:val="es-ES"/>
-        </w:rPr>
-        <w:t>GLMs</w:t>
-      </w:r>
-      <w:proofErr w:type="spellEnd"/>
-      <w:r>
-        <w:rPr>
-          <w:lang w:val="es-ES"/>
-        </w:rPr>
-        <w:t xml:space="preserve"> olvidados y llevaba más de un mes sin dar nada de análisis de datos y estadística. Por suerte, me adapté rápido. Y como pequeño matiz, al trabajar en el laboratorio de fitopatología durante muchas horas, sí que es verdad que terminé algo mareado por el aire acondicionado</w:t>
+        <w:t xml:space="preserve"> de hecho, tuve que usar algunos fines de semana para terminar parte de las prácticas, lo cual no me importaba demasiado porque eran solo unas pocas horas, pero sí que considero que al final en relación a los conocimientos que tenía al principio las prácticas eran difíciles. De hecho, las actividades 1 y 2 fueron más que necesarias porque tenía muchos conceptos de ANOVA y GLMs olvidados y llevaba más de un mes sin dar nada de análisis de datos y estadística. Por suerte, me adapté rápido. Y como pequeño matiz, al trabajar en el laboratorio de fitopatología durante muchas horas, sí que es verdad que terminé algo mareado por el aire acondicionado</w:t>
       </w:r>
       <w:r>
         <w:rPr>
@@ -13619,6 +11943,7 @@
   <w:style w:type="character" w:default="1" w:styleId="Fuentedeprrafopredeter">
     <w:name w:val="Default Paragraph Font"/>
     <w:uiPriority w:val="1"/>
+    <w:semiHidden/>
     <w:unhideWhenUsed/>
   </w:style>
   <w:style w:type="table" w:default="1" w:styleId="Tablanormal">

</xml_diff>